<commit_message>
fix for 54 and 53
</commit_message>
<xml_diff>
--- a/models/tools/pruning-and-refactoring/equipment-augment/src/main/resources/equipmentAugment/Gendoc/gendocTemplate.docx
+++ b/models/tools/pruning-and-refactoring/equipment-augment/src/main/resources/equipmentAugment/Gendoc/gendocTemplate.docx
@@ -1,6 +1,6 @@
 
 <file path=word/document.xml><?xml version="1.0" encoding="utf-8"?>
-<w:document xmlns:wpc="http://schemas.microsoft.com/office/word/2010/wordprocessingCanvas" xmlns:cx="http://schemas.microsoft.com/office/drawing/2014/chartex" xmlns:cx1="http://schemas.microsoft.com/office/drawing/2015/9/8/chartex" xmlns:cx2="http://schemas.microsoft.com/office/drawing/2015/10/21/chartex" xmlns:cx3="http://schemas.microsoft.com/office/drawing/2016/5/9/chartex" xmlns:cx4="http://schemas.microsoft.com/office/drawing/2016/5/10/chartex" xmlns:cx5="http://schemas.microsoft.com/office/drawing/2016/5/11/chartex" xmlns:cx6="http://schemas.microsoft.com/office/drawing/2016/5/12/chartex" xmlns:cx7="http://schemas.microsoft.com/office/drawing/2016/5/13/chartex" xmlns:cx8="http://schemas.microsoft.com/office/drawing/2016/5/14/chartex" xmlns:mc="http://schemas.openxmlformats.org/markup-compatibility/2006" xmlns:aink="http://schemas.microsoft.com/office/drawing/2016/ink" xmlns:am3d="http://schemas.microsoft.com/office/drawing/2017/model3d" xmlns:o="urn:schemas-microsoft-com:office:office" xmlns:oel="http://schemas.microsoft.com/office/2019/extlst" xmlns:r="http://schemas.openxmlformats.org/officeDocument/2006/relationships" xmlns:m="http://schemas.openxmlformats.org/officeDocument/2006/math" xmlns:v="urn:schemas-microsoft-com:vml" xmlns:wp14="http://schemas.microsoft.com/office/word/2010/wordprocessingDrawing" xmlns:wp="http://schemas.openxmlformats.org/drawingml/2006/wordprocessingDrawing" xmlns:w10="urn:schemas-microsoft-com:office:word" xmlns:w="http://schemas.openxmlformats.org/wordprocessingml/2006/main" xmlns:w14="http://schemas.microsoft.com/office/word/2010/wordml" xmlns:w15="http://schemas.microsoft.com/office/word/2012/wordml" xmlns:w16cex="http://schemas.microsoft.com/office/word/2018/wordml/cex" xmlns:w16cid="http://schemas.microsoft.com/office/word/2016/wordml/cid" xmlns:w16="http://schemas.microsoft.com/office/word/2018/wordml" xmlns:w16sdtdh="http://schemas.microsoft.com/office/word/2020/wordml/sdtdatahash" xmlns:w16se="http://schemas.microsoft.com/office/word/2015/wordml/symex" xmlns:wpg="http://schemas.microsoft.com/office/word/2010/wordprocessingGroup" xmlns:wpi="http://schemas.microsoft.com/office/word/2010/wordprocessingInk" xmlns:wne="http://schemas.microsoft.com/office/word/2006/wordml" xmlns:wps="http://schemas.microsoft.com/office/word/2010/wordprocessingShape" mc:Ignorable="w14 w15 w16se w16cid w16 w16cex w16sdtdh wp14">
+<w:document xmlns:wpc="http://schemas.microsoft.com/office/word/2010/wordprocessingCanvas" xmlns:cx="http://schemas.microsoft.com/office/drawing/2014/chartex" xmlns:cx1="http://schemas.microsoft.com/office/drawing/2015/9/8/chartex" xmlns:cx2="http://schemas.microsoft.com/office/drawing/2015/10/21/chartex" xmlns:cx3="http://schemas.microsoft.com/office/drawing/2016/5/9/chartex" xmlns:cx4="http://schemas.microsoft.com/office/drawing/2016/5/10/chartex" xmlns:cx5="http://schemas.microsoft.com/office/drawing/2016/5/11/chartex" xmlns:cx6="http://schemas.microsoft.com/office/drawing/2016/5/12/chartex" xmlns:cx7="http://schemas.microsoft.com/office/drawing/2016/5/13/chartex" xmlns:cx8="http://schemas.microsoft.com/office/drawing/2016/5/14/chartex" xmlns:mc="http://schemas.openxmlformats.org/markup-compatibility/2006" xmlns:aink="http://schemas.microsoft.com/office/drawing/2016/ink" xmlns:am3d="http://schemas.microsoft.com/office/drawing/2017/model3d" xmlns:o="urn:schemas-microsoft-com:office:office" xmlns:oel="http://schemas.microsoft.com/office/2019/extlst" xmlns:r="http://schemas.openxmlformats.org/officeDocument/2006/relationships" xmlns:m="http://schemas.openxmlformats.org/officeDocument/2006/math" xmlns:v="urn:schemas-microsoft-com:vml" xmlns:wp14="http://schemas.microsoft.com/office/word/2010/wordprocessingDrawing" xmlns:wp="http://schemas.openxmlformats.org/drawingml/2006/wordprocessingDrawing" xmlns:w10="urn:schemas-microsoft-com:office:word" xmlns:w="http://schemas.openxmlformats.org/wordprocessingml/2006/main" xmlns:w14="http://schemas.microsoft.com/office/word/2010/wordml" xmlns:w15="http://schemas.microsoft.com/office/word/2012/wordml" xmlns:w16cex="http://schemas.microsoft.com/office/word/2018/wordml/cex" xmlns:w16cid="http://schemas.microsoft.com/office/word/2016/wordml/cid" xmlns:w16="http://schemas.microsoft.com/office/word/2018/wordml" xmlns:w16du="http://schemas.microsoft.com/office/word/2023/wordml/word16du" xmlns:w16sdtdh="http://schemas.microsoft.com/office/word/2020/wordml/sdtdatahash" xmlns:w16sdtfl="http://schemas.microsoft.com/office/word/2024/wordml/sdtformatlock" xmlns:w16se="http://schemas.microsoft.com/office/word/2015/wordml/symex" xmlns:wpg="http://schemas.microsoft.com/office/word/2010/wordprocessingGroup" xmlns:wpi="http://schemas.microsoft.com/office/word/2010/wordprocessingInk" xmlns:wne="http://schemas.microsoft.com/office/word/2006/wordml" xmlns:wps="http://schemas.microsoft.com/office/word/2010/wordprocessingShape" mc:Ignorable="w14 w15 w16se w16cid w16 w16cex w16sdtdh w16sdtfl w16du wp14">
   <w:background w:color="FFFFFF"/>
   <w:body>
     <w:p>
@@ -51,7 +51,7 @@
           <w:color w:val="984806" w:themeColor="accent6" w:themeShade="80"/>
           <w:lang w:val="en-GB"/>
         </w:rPr>
-        <w:t>Equipment</w:t>
+        <w:t>EquipmentAugment</w:t>
       </w:r>
       <w:r>
         <w:rPr>
@@ -59,7 +59,7 @@
           <w:color w:val="984806" w:themeColor="accent6" w:themeShade="80"/>
           <w:lang w:val="en-GB"/>
         </w:rPr>
-        <w:t>Augment</w:t>
+        <w:t>_</w:t>
       </w:r>
       <w:r>
         <w:rPr>
@@ -67,7 +67,7 @@
           <w:color w:val="984806" w:themeColor="accent6" w:themeShade="80"/>
           <w:lang w:val="en-GB"/>
         </w:rPr>
-        <w:t>_</w:t>
+        <w:t>1</w:t>
       </w:r>
       <w:r>
         <w:rPr>
@@ -75,7 +75,7 @@
           <w:color w:val="984806" w:themeColor="accent6" w:themeShade="80"/>
           <w:lang w:val="en-GB"/>
         </w:rPr>
-        <w:t>1</w:t>
+        <w:t>.</w:t>
       </w:r>
       <w:r>
         <w:rPr>
@@ -83,7 +83,15 @@
           <w:color w:val="984806" w:themeColor="accent6" w:themeShade="80"/>
           <w:lang w:val="en-GB"/>
         </w:rPr>
-        <w:t>.0.0-ts</w:t>
+        <w:t>2</w:t>
+      </w:r>
+      <w:r>
+        <w:rPr>
+          <w:rFonts w:asciiTheme="minorHAnsi" w:hAnsiTheme="minorHAnsi"/>
+          <w:color w:val="984806" w:themeColor="accent6" w:themeShade="80"/>
+          <w:lang w:val="en-GB"/>
+        </w:rPr>
+        <w:t>.0-ts</w:t>
       </w:r>
       <w:r>
         <w:rPr>
@@ -202,23 +210,25 @@
           <w:color w:val="984806" w:themeColor="accent6" w:themeShade="80"/>
           <w:lang w:val="en-GB"/>
         </w:rPr>
-        <w:t>’${project_loc}\</w:t>
-      </w:r>
+        <w:t>’${project_</w:t>
+      </w:r>
+      <w:proofErr w:type="gramStart"/>
       <w:r>
         <w:rPr>
           <w:rFonts w:asciiTheme="minorHAnsi" w:hAnsiTheme="minorHAnsi"/>
           <w:color w:val="984806" w:themeColor="accent6" w:themeShade="80"/>
           <w:lang w:val="en-GB"/>
         </w:rPr>
-        <w:t>Equipment</w:t>
-      </w:r>
+        <w:t>loc}\</w:t>
+      </w:r>
+      <w:proofErr w:type="gramEnd"/>
       <w:r>
         <w:rPr>
           <w:rFonts w:asciiTheme="minorHAnsi" w:hAnsiTheme="minorHAnsi"/>
           <w:color w:val="984806" w:themeColor="accent6" w:themeShade="80"/>
           <w:lang w:val="en-GB"/>
         </w:rPr>
-        <w:t>Augment</w:t>
+        <w:t>EquipmentAugment</w:t>
       </w:r>
       <w:r>
         <w:rPr>
@@ -234,15 +244,69 @@
           <w:color w:val="984806" w:themeColor="accent6" w:themeShade="80"/>
           <w:lang w:val="en-GB"/>
         </w:rPr>
-        <w:t>' element=’{0}’</w:t>
-      </w:r>
+        <w:t>' element=</w:t>
+      </w:r>
+      <w:proofErr w:type="gramStart"/>
       <w:r>
         <w:rPr>
           <w:rFonts w:asciiTheme="minorHAnsi" w:hAnsiTheme="minorHAnsi"/>
-          <w:color w:val="7030A0"/>
+          <w:color w:val="984806" w:themeColor="accent6" w:themeShade="80"/>
           <w:lang w:val="en-GB"/>
         </w:rPr>
-        <w:t xml:space="preserve"> element=’{0}’ importedBundles='gmf;papyrus' /&gt;</w:t>
+        <w:t>’{</w:t>
+      </w:r>
+      <w:proofErr w:type="gramEnd"/>
+      <w:r>
+        <w:rPr>
+          <w:rFonts w:asciiTheme="minorHAnsi" w:hAnsiTheme="minorHAnsi"/>
+          <w:color w:val="984806" w:themeColor="accent6" w:themeShade="80"/>
+          <w:lang w:val="en-GB"/>
+        </w:rPr>
+        <w:t>0}’</w:t>
+      </w:r>
+      <w:r>
+        <w:rPr>
+          <w:rFonts w:asciiTheme="minorHAnsi" w:hAnsiTheme="minorHAnsi"/>
+          <w:color w:val="7030A0"/>
+          <w:lang w:val="en-GB"/>
+        </w:rPr>
+        <w:t xml:space="preserve"> element=</w:t>
+      </w:r>
+      <w:proofErr w:type="gramStart"/>
+      <w:r>
+        <w:rPr>
+          <w:rFonts w:asciiTheme="minorHAnsi" w:hAnsiTheme="minorHAnsi"/>
+          <w:color w:val="7030A0"/>
+          <w:lang w:val="en-GB"/>
+        </w:rPr>
+        <w:t>’{</w:t>
+      </w:r>
+      <w:proofErr w:type="gramEnd"/>
+      <w:r>
+        <w:rPr>
+          <w:rFonts w:asciiTheme="minorHAnsi" w:hAnsiTheme="minorHAnsi"/>
+          <w:color w:val="7030A0"/>
+          <w:lang w:val="en-GB"/>
+        </w:rPr>
+        <w:t>0}’ importedBundles='</w:t>
+      </w:r>
+      <w:proofErr w:type="gramStart"/>
+      <w:r>
+        <w:rPr>
+          <w:rFonts w:asciiTheme="minorHAnsi" w:hAnsiTheme="minorHAnsi"/>
+          <w:color w:val="7030A0"/>
+          <w:lang w:val="en-GB"/>
+        </w:rPr>
+        <w:t>gmf;papyrus</w:t>
+      </w:r>
+      <w:proofErr w:type="gramEnd"/>
+      <w:r>
+        <w:rPr>
+          <w:rFonts w:asciiTheme="minorHAnsi" w:hAnsiTheme="minorHAnsi"/>
+          <w:color w:val="7030A0"/>
+          <w:lang w:val="en-GB"/>
+        </w:rPr>
+        <w:t>' /&gt;</w:t>
       </w:r>
       <w:r>
         <w:rPr>
@@ -401,8 +465,9 @@
           <w:szCs w:val="20"/>
           <w:lang w:val="en-GB"/>
         </w:rPr>
-        <w:t>’${project_loc}\</w:t>
-      </w:r>
+        <w:t>’${project_</w:t>
+      </w:r>
+      <w:proofErr w:type="gramStart"/>
       <w:r>
         <w:rPr>
           <w:rFonts w:ascii="Calibri" w:eastAsia="Times New Roman" w:hAnsi="Calibri" w:cs="Calibri"/>
@@ -411,8 +476,9 @@
           <w:szCs w:val="20"/>
           <w:lang w:val="en-GB"/>
         </w:rPr>
-        <w:t>Equipment</w:t>
-      </w:r>
+        <w:t>loc}\</w:t>
+      </w:r>
+      <w:proofErr w:type="gramEnd"/>
       <w:r>
         <w:rPr>
           <w:rFonts w:ascii="Calibri" w:eastAsia="Times New Roman" w:hAnsi="Calibri" w:cs="Calibri"/>
@@ -421,7 +487,7 @@
           <w:szCs w:val="20"/>
           <w:lang w:val="en-GB"/>
         </w:rPr>
-        <w:t>Augment</w:t>
+        <w:t>EquipmentAugment</w:t>
       </w:r>
       <w:r>
         <w:rPr>
@@ -451,7 +517,51 @@
           <w:szCs w:val="20"/>
           <w:lang w:val="en-GB"/>
         </w:rPr>
-        <w:t xml:space="preserve"> element=’{0}’ importedBundles='gmf;papyrus' /&gt;</w:t>
+        <w:t xml:space="preserve"> element=</w:t>
+      </w:r>
+      <w:proofErr w:type="gramStart"/>
+      <w:r>
+        <w:rPr>
+          <w:rFonts w:asciiTheme="minorHAnsi" w:hAnsiTheme="minorHAnsi"/>
+          <w:color w:val="7030A0"/>
+          <w:sz w:val="20"/>
+          <w:szCs w:val="20"/>
+          <w:lang w:val="en-GB"/>
+        </w:rPr>
+        <w:t>’{</w:t>
+      </w:r>
+      <w:proofErr w:type="gramEnd"/>
+      <w:r>
+        <w:rPr>
+          <w:rFonts w:asciiTheme="minorHAnsi" w:hAnsiTheme="minorHAnsi"/>
+          <w:color w:val="7030A0"/>
+          <w:sz w:val="20"/>
+          <w:szCs w:val="20"/>
+          <w:lang w:val="en-GB"/>
+        </w:rPr>
+        <w:t>0}’ importedBundles='</w:t>
+      </w:r>
+      <w:proofErr w:type="gramStart"/>
+      <w:r>
+        <w:rPr>
+          <w:rFonts w:asciiTheme="minorHAnsi" w:hAnsiTheme="minorHAnsi"/>
+          <w:color w:val="7030A0"/>
+          <w:sz w:val="20"/>
+          <w:szCs w:val="20"/>
+          <w:lang w:val="en-GB"/>
+        </w:rPr>
+        <w:t>gmf;papyrus</w:t>
+      </w:r>
+      <w:proofErr w:type="gramEnd"/>
+      <w:r>
+        <w:rPr>
+          <w:rFonts w:asciiTheme="minorHAnsi" w:hAnsiTheme="minorHAnsi"/>
+          <w:color w:val="7030A0"/>
+          <w:sz w:val="20"/>
+          <w:szCs w:val="20"/>
+          <w:lang w:val="en-GB"/>
+        </w:rPr>
+        <w:t>' /&gt;</w:t>
       </w:r>
     </w:p>
     <w:p>
@@ -533,7 +643,39 @@
           <w:bCs/>
           <w:color w:val="7030A0"/>
         </w:rPr>
-        <w:t>[for (cl:Class | Class.allInstances()-&gt;sortedBy(name))]&lt;drop/&gt;</w:t>
+        <w:t>[for (</w:t>
+      </w:r>
+      <w:proofErr w:type="gramStart"/>
+      <w:r>
+        <w:rPr>
+          <w:bCs/>
+          <w:color w:val="7030A0"/>
+        </w:rPr>
+        <w:t>cl:Class</w:t>
+      </w:r>
+      <w:proofErr w:type="gramEnd"/>
+      <w:r>
+        <w:rPr>
+          <w:bCs/>
+          <w:color w:val="7030A0"/>
+        </w:rPr>
+        <w:t xml:space="preserve"> | Class.allInstances()-&gt;sortedBy(name)</w:t>
+      </w:r>
+      <w:proofErr w:type="gramStart"/>
+      <w:r>
+        <w:rPr>
+          <w:bCs/>
+          <w:color w:val="7030A0"/>
+        </w:rPr>
+        <w:t>)]&lt;</w:t>
+      </w:r>
+      <w:proofErr w:type="gramEnd"/>
+      <w:r>
+        <w:rPr>
+          <w:bCs/>
+          <w:color w:val="7030A0"/>
+        </w:rPr>
+        <w:t>drop/&gt;</w:t>
       </w:r>
     </w:p>
     <w:p>
@@ -555,13 +697,41 @@
         <w:rPr>
           <w:color w:val="7030A0"/>
         </w:rPr>
-        <w:t>[for (co:Com</w:t>
-      </w:r>
-      <w:r>
-        <w:rPr>
-          <w:color w:val="7030A0"/>
-        </w:rPr>
-        <w:t>ment | cl.ownedComment)]&lt;drop/&gt;</w:t>
+        <w:t>[for (</w:t>
+      </w:r>
+      <w:proofErr w:type="gramStart"/>
+      <w:r>
+        <w:rPr>
+          <w:color w:val="7030A0"/>
+        </w:rPr>
+        <w:t>co:Com</w:t>
+      </w:r>
+      <w:r>
+        <w:rPr>
+          <w:color w:val="7030A0"/>
+        </w:rPr>
+        <w:t>ment</w:t>
+      </w:r>
+      <w:proofErr w:type="gramEnd"/>
+      <w:r>
+        <w:rPr>
+          <w:color w:val="7030A0"/>
+        </w:rPr>
+        <w:t xml:space="preserve"> | </w:t>
+      </w:r>
+      <w:proofErr w:type="gramStart"/>
+      <w:r>
+        <w:rPr>
+          <w:color w:val="7030A0"/>
+        </w:rPr>
+        <w:t>cl.ownedComment)]&lt;</w:t>
+      </w:r>
+      <w:proofErr w:type="gramEnd"/>
+      <w:r>
+        <w:rPr>
+          <w:color w:val="7030A0"/>
+        </w:rPr>
+        <w:t>drop/&gt;</w:t>
       </w:r>
     </w:p>
     <w:p>
@@ -580,8 +750,17 @@
       <w:r>
         <w:t>[co._</w:t>
       </w:r>
-      <w:r>
-        <w:t>body.clean()/</w:t>
+      <w:proofErr w:type="gramStart"/>
+      <w:r>
+        <w:t>body.clean</w:t>
+      </w:r>
+      <w:proofErr w:type="gramEnd"/>
+      <w:r>
+        <w:t>()</w:t>
+      </w:r>
+      <w:proofErr w:type="gramStart"/>
+      <w:r>
+        <w:t>/</w:t>
       </w:r>
       <w:r>
         <w:t>]</w:t>
@@ -590,7 +769,14 @@
         <w:rPr>
           <w:color w:val="7030A0"/>
         </w:rPr>
-        <w:t>&lt;/dropEmpty&gt;</w:t>
+        <w:t>&lt;</w:t>
+      </w:r>
+      <w:proofErr w:type="gramEnd"/>
+      <w:r>
+        <w:rPr>
+          <w:color w:val="7030A0"/>
+        </w:rPr>
+        <w:t>/dropEmpty&gt;</w:t>
       </w:r>
     </w:p>
     <w:p>
@@ -631,7 +817,49 @@
         <w:rPr>
           <w:color w:val="7030A0"/>
         </w:rPr>
-        <w:t>[for (st:Stereotype | cl.getAppliedStereotypes())]&lt;drop/&gt;</w:t>
+        <w:t>[for (</w:t>
+      </w:r>
+      <w:proofErr w:type="gramStart"/>
+      <w:r>
+        <w:rPr>
+          <w:color w:val="7030A0"/>
+        </w:rPr>
+        <w:t>st:Stereotype</w:t>
+      </w:r>
+      <w:proofErr w:type="gramEnd"/>
+      <w:r>
+        <w:rPr>
+          <w:color w:val="7030A0"/>
+        </w:rPr>
+        <w:t xml:space="preserve"> | </w:t>
+      </w:r>
+      <w:proofErr w:type="gramStart"/>
+      <w:r>
+        <w:rPr>
+          <w:color w:val="7030A0"/>
+        </w:rPr>
+        <w:t>cl.getAppliedStereotypes</w:t>
+      </w:r>
+      <w:proofErr w:type="gramEnd"/>
+      <w:r>
+        <w:rPr>
+          <w:color w:val="7030A0"/>
+        </w:rPr>
+        <w:t>()</w:t>
+      </w:r>
+      <w:proofErr w:type="gramStart"/>
+      <w:r>
+        <w:rPr>
+          <w:color w:val="7030A0"/>
+        </w:rPr>
+        <w:t>)]&lt;</w:t>
+      </w:r>
+      <w:proofErr w:type="gramEnd"/>
+      <w:r>
+        <w:rPr>
+          <w:color w:val="7030A0"/>
+        </w:rPr>
+        <w:t>drop/&gt;</w:t>
       </w:r>
     </w:p>
     <w:p>
@@ -655,7 +883,21 @@
         <w:rPr>
           <w:color w:val="7030A0"/>
         </w:rPr>
-        <w:t>[for (oa:Property|st.ownedAttribute)]&lt;drop/&gt;</w:t>
+        <w:t>[for (</w:t>
+      </w:r>
+      <w:proofErr w:type="gramStart"/>
+      <w:r>
+        <w:rPr>
+          <w:color w:val="7030A0"/>
+        </w:rPr>
+        <w:t>oa:Property|st.ownedAttribute)]&lt;</w:t>
+      </w:r>
+      <w:proofErr w:type="gramEnd"/>
+      <w:r>
+        <w:rPr>
+          <w:color w:val="7030A0"/>
+        </w:rPr>
+        <w:t>drop/&gt;</w:t>
       </w:r>
     </w:p>
     <w:p>
@@ -799,7 +1041,39 @@
           <w:bCs/>
           <w:color w:val="7030A0"/>
         </w:rPr>
-        <w:t>[if  cl.ownedAttribute-&gt;notEmpty()]&lt;drop/&gt;</w:t>
+        <w:t>[</w:t>
+      </w:r>
+      <w:proofErr w:type="gramStart"/>
+      <w:r>
+        <w:rPr>
+          <w:bCs/>
+          <w:color w:val="7030A0"/>
+        </w:rPr>
+        <w:t>if  cl</w:t>
+      </w:r>
+      <w:proofErr w:type="gramEnd"/>
+      <w:r>
+        <w:rPr>
+          <w:bCs/>
+          <w:color w:val="7030A0"/>
+        </w:rPr>
+        <w:t>.ownedAttribute-&gt;notEmpty(</w:t>
+      </w:r>
+      <w:proofErr w:type="gramStart"/>
+      <w:r>
+        <w:rPr>
+          <w:bCs/>
+          <w:color w:val="7030A0"/>
+        </w:rPr>
+        <w:t>)]&lt;</w:t>
+      </w:r>
+      <w:proofErr w:type="gramEnd"/>
+      <w:r>
+        <w:rPr>
+          <w:bCs/>
+          <w:color w:val="7030A0"/>
+        </w:rPr>
+        <w:t>drop/&gt;</w:t>
       </w:r>
     </w:p>
     <w:p>
@@ -1075,7 +1349,21 @@
         <w:rPr>
           <w:color w:val="7030A0"/>
         </w:rPr>
-        <w:t>[for (p:Property|cl.ownedAttribute)]&lt;drop/&gt;</w:t>
+        <w:t>[for (</w:t>
+      </w:r>
+      <w:proofErr w:type="gramStart"/>
+      <w:r>
+        <w:rPr>
+          <w:color w:val="7030A0"/>
+        </w:rPr>
+        <w:t>p:Property|cl.ownedAttribute)]&lt;</w:t>
+      </w:r>
+      <w:proofErr w:type="gramEnd"/>
+      <w:r>
+        <w:rPr>
+          <w:color w:val="7030A0"/>
+        </w:rPr>
+        <w:t>drop/&gt;</w:t>
       </w:r>
     </w:p>
     <w:tbl>
@@ -1166,7 +1454,135 @@
                 <w:sz w:val="16"/>
                 <w:szCs w:val="16"/>
               </w:rPr>
-              <w:t>[if(p.lower=p.upper)]1[else][p.lower/]..[if(p.upper=-1)]*[else][p.upper/][/if][/if]</w:t>
+              <w:t>[if(</w:t>
+            </w:r>
+            <w:proofErr w:type="gramStart"/>
+            <w:r>
+              <w:rPr>
+                <w:sz w:val="16"/>
+                <w:szCs w:val="16"/>
+              </w:rPr>
+              <w:t>p.lower</w:t>
+            </w:r>
+            <w:proofErr w:type="gramEnd"/>
+            <w:r>
+              <w:rPr>
+                <w:sz w:val="16"/>
+                <w:szCs w:val="16"/>
+              </w:rPr>
+              <w:t>=</w:t>
+            </w:r>
+            <w:proofErr w:type="gramStart"/>
+            <w:r>
+              <w:rPr>
+                <w:sz w:val="16"/>
+                <w:szCs w:val="16"/>
+              </w:rPr>
+              <w:t>p.upper</w:t>
+            </w:r>
+            <w:proofErr w:type="gramEnd"/>
+            <w:r>
+              <w:rPr>
+                <w:sz w:val="16"/>
+                <w:szCs w:val="16"/>
+              </w:rPr>
+              <w:t>)]1[else][</w:t>
+            </w:r>
+            <w:proofErr w:type="gramStart"/>
+            <w:r>
+              <w:rPr>
+                <w:sz w:val="16"/>
+                <w:szCs w:val="16"/>
+              </w:rPr>
+              <w:t>p.lower</w:t>
+            </w:r>
+            <w:proofErr w:type="gramEnd"/>
+            <w:r>
+              <w:rPr>
+                <w:sz w:val="16"/>
+                <w:szCs w:val="16"/>
+              </w:rPr>
+              <w:t>/</w:t>
+            </w:r>
+            <w:proofErr w:type="gramStart"/>
+            <w:r>
+              <w:rPr>
+                <w:sz w:val="16"/>
+                <w:szCs w:val="16"/>
+              </w:rPr>
+              <w:t>]..</w:t>
+            </w:r>
+            <w:proofErr w:type="gramEnd"/>
+            <w:r>
+              <w:rPr>
+                <w:sz w:val="16"/>
+                <w:szCs w:val="16"/>
+              </w:rPr>
+              <w:t>[if(</w:t>
+            </w:r>
+            <w:proofErr w:type="gramStart"/>
+            <w:r>
+              <w:rPr>
+                <w:sz w:val="16"/>
+                <w:szCs w:val="16"/>
+              </w:rPr>
+              <w:t>p.upper</w:t>
+            </w:r>
+            <w:proofErr w:type="gramEnd"/>
+            <w:r>
+              <w:rPr>
+                <w:sz w:val="16"/>
+                <w:szCs w:val="16"/>
+              </w:rPr>
+              <w:t>=-1</w:t>
+            </w:r>
+            <w:proofErr w:type="gramStart"/>
+            <w:r>
+              <w:rPr>
+                <w:sz w:val="16"/>
+                <w:szCs w:val="16"/>
+              </w:rPr>
+              <w:t>)]*</w:t>
+            </w:r>
+            <w:proofErr w:type="gramEnd"/>
+            <w:r>
+              <w:rPr>
+                <w:sz w:val="16"/>
+                <w:szCs w:val="16"/>
+              </w:rPr>
+              <w:t>[else][</w:t>
+            </w:r>
+            <w:proofErr w:type="gramStart"/>
+            <w:r>
+              <w:rPr>
+                <w:sz w:val="16"/>
+                <w:szCs w:val="16"/>
+              </w:rPr>
+              <w:t>p.upper/][</w:t>
+            </w:r>
+            <w:proofErr w:type="gramEnd"/>
+            <w:r>
+              <w:rPr>
+                <w:sz w:val="16"/>
+                <w:szCs w:val="16"/>
+              </w:rPr>
+              <w:t>/</w:t>
+            </w:r>
+            <w:proofErr w:type="gramStart"/>
+            <w:r>
+              <w:rPr>
+                <w:sz w:val="16"/>
+                <w:szCs w:val="16"/>
+              </w:rPr>
+              <w:t>if][</w:t>
+            </w:r>
+            <w:proofErr w:type="gramEnd"/>
+            <w:r>
+              <w:rPr>
+                <w:sz w:val="16"/>
+                <w:szCs w:val="16"/>
+              </w:rPr>
+              <w:t>/if]</w:t>
             </w:r>
           </w:p>
         </w:tc>
@@ -2014,7 +2430,21 @@
         <w:rPr>
           <w:color w:val="7030A0"/>
         </w:rPr>
-        <w:t>[else][/if]&lt;drop/&gt;</w:t>
+        <w:t>[else][/</w:t>
+      </w:r>
+      <w:proofErr w:type="gramStart"/>
+      <w:r>
+        <w:rPr>
+          <w:color w:val="7030A0"/>
+        </w:rPr>
+        <w:t>if]&lt;</w:t>
+      </w:r>
+      <w:proofErr w:type="gramEnd"/>
+      <w:r>
+        <w:rPr>
+          <w:color w:val="7030A0"/>
+        </w:rPr>
+        <w:t>drop/&gt;</w:t>
       </w:r>
     </w:p>
     <w:p>
@@ -2050,7 +2480,35 @@
         <w:rPr>
           <w:color w:val="7030A0"/>
         </w:rPr>
-        <w:t>[for (dt:DataType | DataType.allInstances()-&gt;sortedBy(name))]&lt;drop/&gt;</w:t>
+        <w:t>[for (</w:t>
+      </w:r>
+      <w:proofErr w:type="gramStart"/>
+      <w:r>
+        <w:rPr>
+          <w:color w:val="7030A0"/>
+        </w:rPr>
+        <w:t>dt:DataType</w:t>
+      </w:r>
+      <w:proofErr w:type="gramEnd"/>
+      <w:r>
+        <w:rPr>
+          <w:color w:val="7030A0"/>
+        </w:rPr>
+        <w:t xml:space="preserve"> | DataType.allInstances()-&gt;sortedBy(name)</w:t>
+      </w:r>
+      <w:proofErr w:type="gramStart"/>
+      <w:r>
+        <w:rPr>
+          <w:color w:val="7030A0"/>
+        </w:rPr>
+        <w:t>)]&lt;</w:t>
+      </w:r>
+      <w:proofErr w:type="gramEnd"/>
+      <w:r>
+        <w:rPr>
+          <w:color w:val="7030A0"/>
+        </w:rPr>
+        <w:t>drop/&gt;</w:t>
       </w:r>
     </w:p>
     <w:p>
@@ -2064,7 +2522,35 @@
         <w:rPr>
           <w:color w:val="7030A0"/>
         </w:rPr>
-        <w:t>[if dt.oclIsTypeOf(DataType)]&lt;drop/&gt;</w:t>
+        <w:t xml:space="preserve">[if </w:t>
+      </w:r>
+      <w:proofErr w:type="gramStart"/>
+      <w:r>
+        <w:rPr>
+          <w:color w:val="7030A0"/>
+        </w:rPr>
+        <w:t>dt.oclIsTypeOf</w:t>
+      </w:r>
+      <w:proofErr w:type="gramEnd"/>
+      <w:r>
+        <w:rPr>
+          <w:color w:val="7030A0"/>
+        </w:rPr>
+        <w:t>(DataType</w:t>
+      </w:r>
+      <w:proofErr w:type="gramStart"/>
+      <w:r>
+        <w:rPr>
+          <w:color w:val="7030A0"/>
+        </w:rPr>
+        <w:t>)]&lt;</w:t>
+      </w:r>
+      <w:proofErr w:type="gramEnd"/>
+      <w:r>
+        <w:rPr>
+          <w:color w:val="7030A0"/>
+        </w:rPr>
+        <w:t>drop/&gt;</w:t>
       </w:r>
     </w:p>
     <w:p>
@@ -2092,13 +2578,41 @@
         <w:rPr>
           <w:color w:val="7030A0"/>
         </w:rPr>
-        <w:t>[for (co:Com</w:t>
-      </w:r>
-      <w:r>
-        <w:rPr>
-          <w:color w:val="7030A0"/>
-        </w:rPr>
-        <w:t>ment | dt.ownedComment)]&lt;drop/&gt;</w:t>
+        <w:t>[for (</w:t>
+      </w:r>
+      <w:proofErr w:type="gramStart"/>
+      <w:r>
+        <w:rPr>
+          <w:color w:val="7030A0"/>
+        </w:rPr>
+        <w:t>co:Com</w:t>
+      </w:r>
+      <w:r>
+        <w:rPr>
+          <w:color w:val="7030A0"/>
+        </w:rPr>
+        <w:t>ment</w:t>
+      </w:r>
+      <w:proofErr w:type="gramEnd"/>
+      <w:r>
+        <w:rPr>
+          <w:color w:val="7030A0"/>
+        </w:rPr>
+        <w:t xml:space="preserve"> | </w:t>
+      </w:r>
+      <w:proofErr w:type="gramStart"/>
+      <w:r>
+        <w:rPr>
+          <w:color w:val="7030A0"/>
+        </w:rPr>
+        <w:t>dt.ownedComment)]&lt;</w:t>
+      </w:r>
+      <w:proofErr w:type="gramEnd"/>
+      <w:r>
+        <w:rPr>
+          <w:color w:val="7030A0"/>
+        </w:rPr>
+        <w:t>drop/&gt;</w:t>
       </w:r>
     </w:p>
     <w:p>
@@ -2117,8 +2631,17 @@
       <w:r>
         <w:t>[co._</w:t>
       </w:r>
-      <w:r>
-        <w:t>body.clean()/</w:t>
+      <w:proofErr w:type="gramStart"/>
+      <w:r>
+        <w:t>body.clean</w:t>
+      </w:r>
+      <w:proofErr w:type="gramEnd"/>
+      <w:r>
+        <w:t>()</w:t>
+      </w:r>
+      <w:proofErr w:type="gramStart"/>
+      <w:r>
+        <w:t>/</w:t>
       </w:r>
       <w:r>
         <w:t>]</w:t>
@@ -2127,7 +2650,14 @@
         <w:rPr>
           <w:color w:val="7030A0"/>
         </w:rPr>
-        <w:t>&lt;/dropEmpty&gt;</w:t>
+        <w:t>&lt;</w:t>
+      </w:r>
+      <w:proofErr w:type="gramEnd"/>
+      <w:r>
+        <w:rPr>
+          <w:color w:val="7030A0"/>
+        </w:rPr>
+        <w:t>/dropEmpty&gt;</w:t>
       </w:r>
     </w:p>
     <w:p>
@@ -2163,7 +2693,49 @@
         <w:rPr>
           <w:color w:val="7030A0"/>
         </w:rPr>
-        <w:t>[for (st:Stereotype | dt.getAppliedStereotypes())]&lt;drop/&gt;</w:t>
+        <w:t>[for (</w:t>
+      </w:r>
+      <w:proofErr w:type="gramStart"/>
+      <w:r>
+        <w:rPr>
+          <w:color w:val="7030A0"/>
+        </w:rPr>
+        <w:t>st:Stereotype</w:t>
+      </w:r>
+      <w:proofErr w:type="gramEnd"/>
+      <w:r>
+        <w:rPr>
+          <w:color w:val="7030A0"/>
+        </w:rPr>
+        <w:t xml:space="preserve"> | </w:t>
+      </w:r>
+      <w:proofErr w:type="gramStart"/>
+      <w:r>
+        <w:rPr>
+          <w:color w:val="7030A0"/>
+        </w:rPr>
+        <w:t>dt.getAppliedStereotypes</w:t>
+      </w:r>
+      <w:proofErr w:type="gramEnd"/>
+      <w:r>
+        <w:rPr>
+          <w:color w:val="7030A0"/>
+        </w:rPr>
+        <w:t>()</w:t>
+      </w:r>
+      <w:proofErr w:type="gramStart"/>
+      <w:r>
+        <w:rPr>
+          <w:color w:val="7030A0"/>
+        </w:rPr>
+        <w:t>)]&lt;</w:t>
+      </w:r>
+      <w:proofErr w:type="gramEnd"/>
+      <w:r>
+        <w:rPr>
+          <w:color w:val="7030A0"/>
+        </w:rPr>
+        <w:t>drop/&gt;</w:t>
       </w:r>
     </w:p>
     <w:p>
@@ -2204,7 +2776,35 @@
         <w:rPr>
           <w:color w:val="7030A0"/>
         </w:rPr>
-        <w:t>[if  dt.ownedAttribute-&gt;notEmpty()]&lt;drop/&gt;</w:t>
+        <w:t>[</w:t>
+      </w:r>
+      <w:proofErr w:type="gramStart"/>
+      <w:r>
+        <w:rPr>
+          <w:color w:val="7030A0"/>
+        </w:rPr>
+        <w:t>if  dt</w:t>
+      </w:r>
+      <w:proofErr w:type="gramEnd"/>
+      <w:r>
+        <w:rPr>
+          <w:color w:val="7030A0"/>
+        </w:rPr>
+        <w:t>.ownedAttribute-&gt;notEmpty(</w:t>
+      </w:r>
+      <w:proofErr w:type="gramStart"/>
+      <w:r>
+        <w:rPr>
+          <w:color w:val="7030A0"/>
+        </w:rPr>
+        <w:t>)]&lt;</w:t>
+      </w:r>
+      <w:proofErr w:type="gramEnd"/>
+      <w:r>
+        <w:rPr>
+          <w:color w:val="7030A0"/>
+        </w:rPr>
+        <w:t>drop/&gt;</w:t>
       </w:r>
     </w:p>
     <w:p>
@@ -2499,7 +3099,23 @@
           <w:bCs/>
           <w:color w:val="7030A0"/>
         </w:rPr>
-        <w:t>[for (p:Property|dt.ownedAttribute)]&lt;drop/&gt;</w:t>
+        <w:t>[for (</w:t>
+      </w:r>
+      <w:proofErr w:type="gramStart"/>
+      <w:r>
+        <w:rPr>
+          <w:bCs/>
+          <w:color w:val="7030A0"/>
+        </w:rPr>
+        <w:t>p:Property|dt.ownedAttribute)]&lt;</w:t>
+      </w:r>
+      <w:proofErr w:type="gramEnd"/>
+      <w:r>
+        <w:rPr>
+          <w:bCs/>
+          <w:color w:val="7030A0"/>
+        </w:rPr>
+        <w:t>drop/&gt;</w:t>
       </w:r>
     </w:p>
     <w:tbl>
@@ -2645,11 +3261,51 @@
                 <w:sz w:val="16"/>
                 <w:szCs w:val="16"/>
               </w:rPr>
-              <w:t>[if(p.lower=p.upper)]</w:t>
-            </w:r>
+              <w:t>[if(</w:t>
+            </w:r>
+            <w:proofErr w:type="gramStart"/>
             <w:r>
               <w:rPr>
                 <w:rFonts w:asciiTheme="minorHAnsi" w:hAnsiTheme="minorHAnsi"/>
+                <w:color w:val="7030A0"/>
+                <w:sz w:val="16"/>
+                <w:szCs w:val="16"/>
+              </w:rPr>
+              <w:t>p.lower</w:t>
+            </w:r>
+            <w:proofErr w:type="gramEnd"/>
+            <w:r>
+              <w:rPr>
+                <w:rFonts w:asciiTheme="minorHAnsi" w:hAnsiTheme="minorHAnsi"/>
+                <w:color w:val="7030A0"/>
+                <w:sz w:val="16"/>
+                <w:szCs w:val="16"/>
+              </w:rPr>
+              <w:t>=</w:t>
+            </w:r>
+            <w:proofErr w:type="gramStart"/>
+            <w:r>
+              <w:rPr>
+                <w:rFonts w:asciiTheme="minorHAnsi" w:hAnsiTheme="minorHAnsi"/>
+                <w:color w:val="7030A0"/>
+                <w:sz w:val="16"/>
+                <w:szCs w:val="16"/>
+              </w:rPr>
+              <w:t>p.upper</w:t>
+            </w:r>
+            <w:proofErr w:type="gramEnd"/>
+            <w:r>
+              <w:rPr>
+                <w:rFonts w:asciiTheme="minorHAnsi" w:hAnsiTheme="minorHAnsi"/>
+                <w:color w:val="7030A0"/>
+                <w:sz w:val="16"/>
+                <w:szCs w:val="16"/>
+              </w:rPr>
+              <w:t>)]</w:t>
+            </w:r>
+            <w:r>
+              <w:rPr>
+                <w:rFonts w:asciiTheme="minorHAnsi" w:hAnsiTheme="minorHAnsi"/>
                 <w:sz w:val="16"/>
                 <w:szCs w:val="16"/>
               </w:rPr>
@@ -2670,25 +3326,84 @@
                 <w:sz w:val="16"/>
                 <w:szCs w:val="16"/>
               </w:rPr>
-              <w:t>[p.lower/]..</w:t>
-            </w:r>
+              <w:t>[</w:t>
+            </w:r>
+            <w:proofErr w:type="gramStart"/>
             <w:r>
               <w:rPr>
                 <w:rFonts w:asciiTheme="minorHAnsi" w:hAnsiTheme="minorHAnsi"/>
-                <w:color w:val="7030A0"/>
-                <w:sz w:val="16"/>
-                <w:szCs w:val="16"/>
-              </w:rPr>
-              <w:t>[if(p.upper=-1)]</w:t>
-            </w:r>
+                <w:sz w:val="16"/>
+                <w:szCs w:val="16"/>
+              </w:rPr>
+              <w:t>p.lower</w:t>
+            </w:r>
+            <w:proofErr w:type="gramEnd"/>
             <w:r>
               <w:rPr>
                 <w:rFonts w:asciiTheme="minorHAnsi" w:hAnsiTheme="minorHAnsi"/>
                 <w:sz w:val="16"/>
                 <w:szCs w:val="16"/>
               </w:rPr>
+              <w:t>/</w:t>
+            </w:r>
+            <w:proofErr w:type="gramStart"/>
+            <w:r>
+              <w:rPr>
+                <w:rFonts w:asciiTheme="minorHAnsi" w:hAnsiTheme="minorHAnsi"/>
+                <w:sz w:val="16"/>
+                <w:szCs w:val="16"/>
+              </w:rPr>
+              <w:t>]..</w:t>
+            </w:r>
+            <w:proofErr w:type="gramEnd"/>
+            <w:r>
+              <w:rPr>
+                <w:rFonts w:asciiTheme="minorHAnsi" w:hAnsiTheme="minorHAnsi"/>
+                <w:color w:val="7030A0"/>
+                <w:sz w:val="16"/>
+                <w:szCs w:val="16"/>
+              </w:rPr>
+              <w:t>[if(</w:t>
+            </w:r>
+            <w:proofErr w:type="gramStart"/>
+            <w:r>
+              <w:rPr>
+                <w:rFonts w:asciiTheme="minorHAnsi" w:hAnsiTheme="minorHAnsi"/>
+                <w:color w:val="7030A0"/>
+                <w:sz w:val="16"/>
+                <w:szCs w:val="16"/>
+              </w:rPr>
+              <w:t>p.upper</w:t>
+            </w:r>
+            <w:proofErr w:type="gramEnd"/>
+            <w:r>
+              <w:rPr>
+                <w:rFonts w:asciiTheme="minorHAnsi" w:hAnsiTheme="minorHAnsi"/>
+                <w:color w:val="7030A0"/>
+                <w:sz w:val="16"/>
+                <w:szCs w:val="16"/>
+              </w:rPr>
+              <w:t>=-1</w:t>
+            </w:r>
+            <w:proofErr w:type="gramStart"/>
+            <w:r>
+              <w:rPr>
+                <w:rFonts w:asciiTheme="minorHAnsi" w:hAnsiTheme="minorHAnsi"/>
+                <w:color w:val="7030A0"/>
+                <w:sz w:val="16"/>
+                <w:szCs w:val="16"/>
+              </w:rPr>
+              <w:t>)]</w:t>
+            </w:r>
+            <w:r>
+              <w:rPr>
+                <w:rFonts w:asciiTheme="minorHAnsi" w:hAnsiTheme="minorHAnsi"/>
+                <w:sz w:val="16"/>
+                <w:szCs w:val="16"/>
+              </w:rPr>
               <w:t>*</w:t>
             </w:r>
+            <w:proofErr w:type="gramEnd"/>
             <w:r>
               <w:rPr>
                 <w:rFonts w:asciiTheme="minorHAnsi" w:hAnsiTheme="minorHAnsi"/>
@@ -2704,16 +3419,55 @@
                 <w:sz w:val="16"/>
                 <w:szCs w:val="16"/>
               </w:rPr>
-              <w:t>[p.upper/]</w:t>
-            </w:r>
+              <w:t>[</w:t>
+            </w:r>
+            <w:proofErr w:type="gramStart"/>
             <w:r>
               <w:rPr>
                 <w:rFonts w:asciiTheme="minorHAnsi" w:hAnsiTheme="minorHAnsi"/>
-                <w:color w:val="7030A0"/>
-                <w:sz w:val="16"/>
-                <w:szCs w:val="16"/>
-              </w:rPr>
-              <w:t>[/if][/if]</w:t>
+                <w:sz w:val="16"/>
+                <w:szCs w:val="16"/>
+              </w:rPr>
+              <w:t>p.upper/]</w:t>
+            </w:r>
+            <w:r>
+              <w:rPr>
+                <w:rFonts w:asciiTheme="minorHAnsi" w:hAnsiTheme="minorHAnsi"/>
+                <w:color w:val="7030A0"/>
+                <w:sz w:val="16"/>
+                <w:szCs w:val="16"/>
+              </w:rPr>
+              <w:t>[</w:t>
+            </w:r>
+            <w:proofErr w:type="gramEnd"/>
+            <w:r>
+              <w:rPr>
+                <w:rFonts w:asciiTheme="minorHAnsi" w:hAnsiTheme="minorHAnsi"/>
+                <w:color w:val="7030A0"/>
+                <w:sz w:val="16"/>
+                <w:szCs w:val="16"/>
+              </w:rPr>
+              <w:t>/</w:t>
+            </w:r>
+            <w:proofErr w:type="gramStart"/>
+            <w:r>
+              <w:rPr>
+                <w:rFonts w:asciiTheme="minorHAnsi" w:hAnsiTheme="minorHAnsi"/>
+                <w:color w:val="7030A0"/>
+                <w:sz w:val="16"/>
+                <w:szCs w:val="16"/>
+              </w:rPr>
+              <w:t>if][</w:t>
+            </w:r>
+            <w:proofErr w:type="gramEnd"/>
+            <w:r>
+              <w:rPr>
+                <w:rFonts w:asciiTheme="minorHAnsi" w:hAnsiTheme="minorHAnsi"/>
+                <w:color w:val="7030A0"/>
+                <w:sz w:val="16"/>
+                <w:szCs w:val="16"/>
+              </w:rPr>
+              <w:t>/if]</w:t>
             </w:r>
           </w:p>
         </w:tc>
@@ -3771,7 +4525,21 @@
         <w:rPr>
           <w:color w:val="7030A0"/>
         </w:rPr>
-        <w:t>[else][/if]&lt;drop/&gt;</w:t>
+        <w:t>[else][/</w:t>
+      </w:r>
+      <w:proofErr w:type="gramStart"/>
+      <w:r>
+        <w:rPr>
+          <w:color w:val="7030A0"/>
+        </w:rPr>
+        <w:t>if]&lt;</w:t>
+      </w:r>
+      <w:proofErr w:type="gramEnd"/>
+      <w:r>
+        <w:rPr>
+          <w:color w:val="7030A0"/>
+        </w:rPr>
+        <w:t>drop/&gt;</w:t>
       </w:r>
     </w:p>
     <w:p>
@@ -3785,7 +4553,21 @@
         <w:rPr>
           <w:color w:val="7030A0"/>
         </w:rPr>
-        <w:t>[else][/if]&lt;drop/&gt;</w:t>
+        <w:t>[else][/</w:t>
+      </w:r>
+      <w:proofErr w:type="gramStart"/>
+      <w:r>
+        <w:rPr>
+          <w:color w:val="7030A0"/>
+        </w:rPr>
+        <w:t>if]&lt;</w:t>
+      </w:r>
+      <w:proofErr w:type="gramEnd"/>
+      <w:r>
+        <w:rPr>
+          <w:color w:val="7030A0"/>
+        </w:rPr>
+        <w:t>drop/&gt;</w:t>
       </w:r>
     </w:p>
     <w:p>
@@ -3824,14 +4606,46 @@
           <w:bCs/>
           <w:color w:val="7030A0"/>
         </w:rPr>
-        <w:t>[for (dt:DataType | DataType.allInsta</w:t>
-      </w:r>
+        <w:t>[for (</w:t>
+      </w:r>
+      <w:proofErr w:type="gramStart"/>
       <w:r>
         <w:rPr>
           <w:bCs/>
           <w:color w:val="7030A0"/>
         </w:rPr>
-        <w:t>nces()-&gt;sortedBy(name))]&lt;drop/&gt;</w:t>
+        <w:t>dt:DataType</w:t>
+      </w:r>
+      <w:proofErr w:type="gramEnd"/>
+      <w:r>
+        <w:rPr>
+          <w:bCs/>
+          <w:color w:val="7030A0"/>
+        </w:rPr>
+        <w:t xml:space="preserve"> | DataType.allInsta</w:t>
+      </w:r>
+      <w:r>
+        <w:rPr>
+          <w:bCs/>
+          <w:color w:val="7030A0"/>
+        </w:rPr>
+        <w:t>nces()-&gt;sortedBy(name)</w:t>
+      </w:r>
+      <w:proofErr w:type="gramStart"/>
+      <w:r>
+        <w:rPr>
+          <w:bCs/>
+          <w:color w:val="7030A0"/>
+        </w:rPr>
+        <w:t>)]&lt;</w:t>
+      </w:r>
+      <w:proofErr w:type="gramEnd"/>
+      <w:r>
+        <w:rPr>
+          <w:bCs/>
+          <w:color w:val="7030A0"/>
+        </w:rPr>
+        <w:t>drop/&gt;</w:t>
       </w:r>
     </w:p>
     <w:p>
@@ -3847,7 +4661,39 @@
           <w:bCs/>
           <w:color w:val="7030A0"/>
         </w:rPr>
-        <w:t>[if dt.oclIsTypeOf(Enumeration)]&lt;drop/&gt;</w:t>
+        <w:t xml:space="preserve">[if </w:t>
+      </w:r>
+      <w:proofErr w:type="gramStart"/>
+      <w:r>
+        <w:rPr>
+          <w:bCs/>
+          <w:color w:val="7030A0"/>
+        </w:rPr>
+        <w:t>dt.oclIsTypeOf</w:t>
+      </w:r>
+      <w:proofErr w:type="gramEnd"/>
+      <w:r>
+        <w:rPr>
+          <w:bCs/>
+          <w:color w:val="7030A0"/>
+        </w:rPr>
+        <w:t>(Enumeration</w:t>
+      </w:r>
+      <w:proofErr w:type="gramStart"/>
+      <w:r>
+        <w:rPr>
+          <w:bCs/>
+          <w:color w:val="7030A0"/>
+        </w:rPr>
+        <w:t>)]&lt;</w:t>
+      </w:r>
+      <w:proofErr w:type="gramEnd"/>
+      <w:r>
+        <w:rPr>
+          <w:bCs/>
+          <w:color w:val="7030A0"/>
+        </w:rPr>
+        <w:t>drop/&gt;</w:t>
       </w:r>
     </w:p>
     <w:p>
@@ -3871,14 +4717,46 @@
           <w:bCs/>
           <w:color w:val="7030A0"/>
         </w:rPr>
-        <w:t>[for (co:Com</w:t>
-      </w:r>
+        <w:t>[for (</w:t>
+      </w:r>
+      <w:proofErr w:type="gramStart"/>
       <w:r>
         <w:rPr>
           <w:bCs/>
           <w:color w:val="7030A0"/>
         </w:rPr>
-        <w:t>ment | dt.ownedComment)]&lt;drop/&gt;</w:t>
+        <w:t>co:Com</w:t>
+      </w:r>
+      <w:r>
+        <w:rPr>
+          <w:bCs/>
+          <w:color w:val="7030A0"/>
+        </w:rPr>
+        <w:t>ment</w:t>
+      </w:r>
+      <w:proofErr w:type="gramEnd"/>
+      <w:r>
+        <w:rPr>
+          <w:bCs/>
+          <w:color w:val="7030A0"/>
+        </w:rPr>
+        <w:t xml:space="preserve"> | </w:t>
+      </w:r>
+      <w:proofErr w:type="gramStart"/>
+      <w:r>
+        <w:rPr>
+          <w:bCs/>
+          <w:color w:val="7030A0"/>
+        </w:rPr>
+        <w:t>dt.ownedComment)]&lt;</w:t>
+      </w:r>
+      <w:proofErr w:type="gramEnd"/>
+      <w:r>
+        <w:rPr>
+          <w:bCs/>
+          <w:color w:val="7030A0"/>
+        </w:rPr>
+        <w:t>drop/&gt;</w:t>
       </w:r>
     </w:p>
     <w:p>
@@ -3898,8 +4776,17 @@
       <w:r>
         <w:t>[co._</w:t>
       </w:r>
-      <w:r>
-        <w:t>body.clean()/</w:t>
+      <w:proofErr w:type="gramStart"/>
+      <w:r>
+        <w:t>body.clean</w:t>
+      </w:r>
+      <w:proofErr w:type="gramEnd"/>
+      <w:r>
+        <w:t>()</w:t>
+      </w:r>
+      <w:proofErr w:type="gramStart"/>
+      <w:r>
+        <w:t>/</w:t>
       </w:r>
       <w:r>
         <w:t>]</w:t>
@@ -3908,7 +4795,14 @@
         <w:rPr>
           <w:color w:val="7030A0"/>
         </w:rPr>
-        <w:t>&lt;/dropEmpty&gt;</w:t>
+        <w:t>&lt;</w:t>
+      </w:r>
+      <w:proofErr w:type="gramEnd"/>
+      <w:r>
+        <w:rPr>
+          <w:color w:val="7030A0"/>
+        </w:rPr>
+        <w:t>/dropEmpty&gt;</w:t>
       </w:r>
     </w:p>
     <w:p>
@@ -3961,7 +4855,39 @@
           <w:color w:val="7030A0"/>
         </w:rPr>
         <w:lastRenderedPageBreak/>
-        <w:t>[for (e:EnumerationLiteral|dt.oclAsType(Enumeration).ownedLiteral)]&lt;drop/&gt;</w:t>
+        <w:t>[for (</w:t>
+      </w:r>
+      <w:proofErr w:type="gramStart"/>
+      <w:r>
+        <w:rPr>
+          <w:bCs/>
+          <w:color w:val="7030A0"/>
+        </w:rPr>
+        <w:t>e:EnumerationLiteral|dt.oclAsType</w:t>
+      </w:r>
+      <w:proofErr w:type="gramEnd"/>
+      <w:r>
+        <w:rPr>
+          <w:bCs/>
+          <w:color w:val="7030A0"/>
+        </w:rPr>
+        <w:t>(Enumeration</w:t>
+      </w:r>
+      <w:proofErr w:type="gramStart"/>
+      <w:r>
+        <w:rPr>
+          <w:bCs/>
+          <w:color w:val="7030A0"/>
+        </w:rPr>
+        <w:t>).ownedLiteral)]&lt;</w:t>
+      </w:r>
+      <w:proofErr w:type="gramEnd"/>
+      <w:r>
+        <w:rPr>
+          <w:bCs/>
+          <w:color w:val="7030A0"/>
+        </w:rPr>
+        <w:t>drop/&gt;</w:t>
       </w:r>
     </w:p>
     <w:p>
@@ -4065,7 +4991,21 @@
         <w:rPr>
           <w:color w:val="7030A0"/>
         </w:rPr>
-        <w:t>[else] [/if]&lt;drop/&gt;</w:t>
+        <w:t>[else] [/</w:t>
+      </w:r>
+      <w:proofErr w:type="gramStart"/>
+      <w:r>
+        <w:rPr>
+          <w:color w:val="7030A0"/>
+        </w:rPr>
+        <w:t>if]&lt;</w:t>
+      </w:r>
+      <w:proofErr w:type="gramEnd"/>
+      <w:r>
+        <w:rPr>
+          <w:color w:val="7030A0"/>
+        </w:rPr>
+        <w:t>drop/&gt;</w:t>
       </w:r>
     </w:p>
     <w:p>
@@ -4101,7 +5041,35 @@
         <w:rPr>
           <w:color w:val="7030A0"/>
         </w:rPr>
-        <w:t>[for (dt:DataType | DataType.allInstances()-&gt;sortedBy(name))]&lt;drop/&gt;</w:t>
+        <w:t>[for (</w:t>
+      </w:r>
+      <w:proofErr w:type="gramStart"/>
+      <w:r>
+        <w:rPr>
+          <w:color w:val="7030A0"/>
+        </w:rPr>
+        <w:t>dt:DataType</w:t>
+      </w:r>
+      <w:proofErr w:type="gramEnd"/>
+      <w:r>
+        <w:rPr>
+          <w:color w:val="7030A0"/>
+        </w:rPr>
+        <w:t xml:space="preserve"> | DataType.allInstances()-&gt;sortedBy(name)</w:t>
+      </w:r>
+      <w:proofErr w:type="gramStart"/>
+      <w:r>
+        <w:rPr>
+          <w:color w:val="7030A0"/>
+        </w:rPr>
+        <w:t>)]&lt;</w:t>
+      </w:r>
+      <w:proofErr w:type="gramEnd"/>
+      <w:r>
+        <w:rPr>
+          <w:color w:val="7030A0"/>
+        </w:rPr>
+        <w:t>drop/&gt;</w:t>
       </w:r>
     </w:p>
     <w:p>
@@ -4115,7 +5083,35 @@
         <w:rPr>
           <w:color w:val="7030A0"/>
         </w:rPr>
-        <w:t>[if dt.oclIsTypeOf(PrimitiveType)]&lt;drop/&gt;</w:t>
+        <w:t xml:space="preserve">[if </w:t>
+      </w:r>
+      <w:proofErr w:type="gramStart"/>
+      <w:r>
+        <w:rPr>
+          <w:color w:val="7030A0"/>
+        </w:rPr>
+        <w:t>dt.oclIsTypeOf</w:t>
+      </w:r>
+      <w:proofErr w:type="gramEnd"/>
+      <w:r>
+        <w:rPr>
+          <w:color w:val="7030A0"/>
+        </w:rPr>
+        <w:t>(PrimitiveType</w:t>
+      </w:r>
+      <w:proofErr w:type="gramStart"/>
+      <w:r>
+        <w:rPr>
+          <w:color w:val="7030A0"/>
+        </w:rPr>
+        <w:t>)]&lt;</w:t>
+      </w:r>
+      <w:proofErr w:type="gramEnd"/>
+      <w:r>
+        <w:rPr>
+          <w:color w:val="7030A0"/>
+        </w:rPr>
+        <w:t>drop/&gt;</w:t>
       </w:r>
     </w:p>
     <w:p>
@@ -4137,13 +5133,41 @@
         <w:rPr>
           <w:color w:val="7030A0"/>
         </w:rPr>
-        <w:t>[for (co:Com</w:t>
-      </w:r>
-      <w:r>
-        <w:rPr>
-          <w:color w:val="7030A0"/>
-        </w:rPr>
-        <w:t>ment | dt.ownedComment)]&lt;drop/&gt;</w:t>
+        <w:t>[for (</w:t>
+      </w:r>
+      <w:proofErr w:type="gramStart"/>
+      <w:r>
+        <w:rPr>
+          <w:color w:val="7030A0"/>
+        </w:rPr>
+        <w:t>co:Com</w:t>
+      </w:r>
+      <w:r>
+        <w:rPr>
+          <w:color w:val="7030A0"/>
+        </w:rPr>
+        <w:t>ment</w:t>
+      </w:r>
+      <w:proofErr w:type="gramEnd"/>
+      <w:r>
+        <w:rPr>
+          <w:color w:val="7030A0"/>
+        </w:rPr>
+        <w:t xml:space="preserve"> | </w:t>
+      </w:r>
+      <w:proofErr w:type="gramStart"/>
+      <w:r>
+        <w:rPr>
+          <w:color w:val="7030A0"/>
+        </w:rPr>
+        <w:t>dt.ownedComment)]&lt;</w:t>
+      </w:r>
+      <w:proofErr w:type="gramEnd"/>
+      <w:r>
+        <w:rPr>
+          <w:color w:val="7030A0"/>
+        </w:rPr>
+        <w:t>drop/&gt;</w:t>
       </w:r>
     </w:p>
     <w:p>
@@ -4162,8 +5186,17 @@
       <w:r>
         <w:t>[co._</w:t>
       </w:r>
-      <w:r>
-        <w:t>body.clean()/</w:t>
+      <w:proofErr w:type="gramStart"/>
+      <w:r>
+        <w:t>body.clean</w:t>
+      </w:r>
+      <w:proofErr w:type="gramEnd"/>
+      <w:r>
+        <w:t>()</w:t>
+      </w:r>
+      <w:proofErr w:type="gramStart"/>
+      <w:r>
+        <w:t>/</w:t>
       </w:r>
       <w:r>
         <w:t>]</w:t>
@@ -4172,7 +5205,14 @@
         <w:rPr>
           <w:color w:val="7030A0"/>
         </w:rPr>
-        <w:t>&lt;/dropEmpty&gt;</w:t>
+        <w:t>&lt;</w:t>
+      </w:r>
+      <w:proofErr w:type="gramEnd"/>
+      <w:r>
+        <w:rPr>
+          <w:color w:val="7030A0"/>
+        </w:rPr>
+        <w:t>/dropEmpty&gt;</w:t>
       </w:r>
     </w:p>
     <w:p>
@@ -4200,7 +5240,21 @@
         <w:rPr>
           <w:color w:val="7030A0"/>
         </w:rPr>
-        <w:t>[else] [/if]&lt;drop/&gt;</w:t>
+        <w:t>[else] [/</w:t>
+      </w:r>
+      <w:proofErr w:type="gramStart"/>
+      <w:r>
+        <w:rPr>
+          <w:color w:val="7030A0"/>
+        </w:rPr>
+        <w:t>if]&lt;</w:t>
+      </w:r>
+      <w:proofErr w:type="gramEnd"/>
+      <w:r>
+        <w:rPr>
+          <w:color w:val="7030A0"/>
+        </w:rPr>
+        <w:t>drop/&gt;</w:t>
       </w:r>
     </w:p>
     <w:p>
@@ -4248,12 +5302,8 @@
       </w:r>
     </w:p>
     <w:sectPr>
-      <w:headerReference w:type="even" r:id="rId9"/>
-      <w:headerReference w:type="default" r:id="rId10"/>
-      <w:footerReference w:type="even" r:id="rId11"/>
-      <w:footerReference w:type="default" r:id="rId12"/>
-      <w:headerReference w:type="first" r:id="rId13"/>
-      <w:footerReference w:type="first" r:id="rId14"/>
+      <w:headerReference w:type="default" r:id="rId9"/>
+      <w:footerReference w:type="default" r:id="rId10"/>
       <w:footnotePr>
         <w:pos w:val="beneathText"/>
       </w:footnotePr>
@@ -4267,7 +5317,7 @@
 </file>
 
 <file path=word/endnotes.xml><?xml version="1.0" encoding="utf-8"?>
-<w:endnotes xmlns:wpc="http://schemas.microsoft.com/office/word/2010/wordprocessingCanvas" xmlns:cx="http://schemas.microsoft.com/office/drawing/2014/chartex" xmlns:cx1="http://schemas.microsoft.com/office/drawing/2015/9/8/chartex" xmlns:cx2="http://schemas.microsoft.com/office/drawing/2015/10/21/chartex" xmlns:cx3="http://schemas.microsoft.com/office/drawing/2016/5/9/chartex" xmlns:cx4="http://schemas.microsoft.com/office/drawing/2016/5/10/chartex" xmlns:cx5="http://schemas.microsoft.com/office/drawing/2016/5/11/chartex" xmlns:cx6="http://schemas.microsoft.com/office/drawing/2016/5/12/chartex" xmlns:cx7="http://schemas.microsoft.com/office/drawing/2016/5/13/chartex" xmlns:cx8="http://schemas.microsoft.com/office/drawing/2016/5/14/chartex" xmlns:mc="http://schemas.openxmlformats.org/markup-compatibility/2006" xmlns:aink="http://schemas.microsoft.com/office/drawing/2016/ink" xmlns:am3d="http://schemas.microsoft.com/office/drawing/2017/model3d" xmlns:o="urn:schemas-microsoft-com:office:office" xmlns:oel="http://schemas.microsoft.com/office/2019/extlst" xmlns:r="http://schemas.openxmlformats.org/officeDocument/2006/relationships" xmlns:m="http://schemas.openxmlformats.org/officeDocument/2006/math" xmlns:v="urn:schemas-microsoft-com:vml" xmlns:wp14="http://schemas.microsoft.com/office/word/2010/wordprocessingDrawing" xmlns:wp="http://schemas.openxmlformats.org/drawingml/2006/wordprocessingDrawing" xmlns:w10="urn:schemas-microsoft-com:office:word" xmlns:w="http://schemas.openxmlformats.org/wordprocessingml/2006/main" xmlns:w14="http://schemas.microsoft.com/office/word/2010/wordml" xmlns:w15="http://schemas.microsoft.com/office/word/2012/wordml" xmlns:w16cex="http://schemas.microsoft.com/office/word/2018/wordml/cex" xmlns:w16cid="http://schemas.microsoft.com/office/word/2016/wordml/cid" xmlns:w16="http://schemas.microsoft.com/office/word/2018/wordml" xmlns:w16sdtdh="http://schemas.microsoft.com/office/word/2020/wordml/sdtdatahash" xmlns:w16se="http://schemas.microsoft.com/office/word/2015/wordml/symex" xmlns:wpg="http://schemas.microsoft.com/office/word/2010/wordprocessingGroup" xmlns:wpi="http://schemas.microsoft.com/office/word/2010/wordprocessingInk" xmlns:wne="http://schemas.microsoft.com/office/word/2006/wordml" xmlns:wps="http://schemas.microsoft.com/office/word/2010/wordprocessingShape" mc:Ignorable="w14 w15 w16se w16cid w16 w16cex w16sdtdh wp14">
+<w:endnotes xmlns:wpc="http://schemas.microsoft.com/office/word/2010/wordprocessingCanvas" xmlns:cx="http://schemas.microsoft.com/office/drawing/2014/chartex" xmlns:cx1="http://schemas.microsoft.com/office/drawing/2015/9/8/chartex" xmlns:cx2="http://schemas.microsoft.com/office/drawing/2015/10/21/chartex" xmlns:cx3="http://schemas.microsoft.com/office/drawing/2016/5/9/chartex" xmlns:cx4="http://schemas.microsoft.com/office/drawing/2016/5/10/chartex" xmlns:cx5="http://schemas.microsoft.com/office/drawing/2016/5/11/chartex" xmlns:cx6="http://schemas.microsoft.com/office/drawing/2016/5/12/chartex" xmlns:cx7="http://schemas.microsoft.com/office/drawing/2016/5/13/chartex" xmlns:cx8="http://schemas.microsoft.com/office/drawing/2016/5/14/chartex" xmlns:mc="http://schemas.openxmlformats.org/markup-compatibility/2006" xmlns:aink="http://schemas.microsoft.com/office/drawing/2016/ink" xmlns:am3d="http://schemas.microsoft.com/office/drawing/2017/model3d" xmlns:o="urn:schemas-microsoft-com:office:office" xmlns:oel="http://schemas.microsoft.com/office/2019/extlst" xmlns:r="http://schemas.openxmlformats.org/officeDocument/2006/relationships" xmlns:m="http://schemas.openxmlformats.org/officeDocument/2006/math" xmlns:v="urn:schemas-microsoft-com:vml" xmlns:wp14="http://schemas.microsoft.com/office/word/2010/wordprocessingDrawing" xmlns:wp="http://schemas.openxmlformats.org/drawingml/2006/wordprocessingDrawing" xmlns:w10="urn:schemas-microsoft-com:office:word" xmlns:w="http://schemas.openxmlformats.org/wordprocessingml/2006/main" xmlns:w14="http://schemas.microsoft.com/office/word/2010/wordml" xmlns:w15="http://schemas.microsoft.com/office/word/2012/wordml" xmlns:w16cex="http://schemas.microsoft.com/office/word/2018/wordml/cex" xmlns:w16cid="http://schemas.microsoft.com/office/word/2016/wordml/cid" xmlns:w16="http://schemas.microsoft.com/office/word/2018/wordml" xmlns:w16du="http://schemas.microsoft.com/office/word/2023/wordml/word16du" xmlns:w16sdtdh="http://schemas.microsoft.com/office/word/2020/wordml/sdtdatahash" xmlns:w16sdtfl="http://schemas.microsoft.com/office/word/2024/wordml/sdtformatlock" xmlns:w16se="http://schemas.microsoft.com/office/word/2015/wordml/symex" xmlns:wpg="http://schemas.microsoft.com/office/word/2010/wordprocessingGroup" xmlns:wpi="http://schemas.microsoft.com/office/word/2010/wordprocessingInk" xmlns:wne="http://schemas.microsoft.com/office/word/2006/wordml" xmlns:wps="http://schemas.microsoft.com/office/word/2010/wordprocessingShape" mc:Ignorable="w14 w15 w16se w16cid w16 w16cex w16sdtdh w16sdtfl w16du wp14">
   <w:endnote w:type="separator" w:id="-1">
     <w:p>
       <w:r>
@@ -4286,17 +5336,7 @@
 </file>
 
 <file path=word/footer1.xml><?xml version="1.0" encoding="utf-8"?>
-<w:ftr xmlns:wpc="http://schemas.microsoft.com/office/word/2010/wordprocessingCanvas" xmlns:cx="http://schemas.microsoft.com/office/drawing/2014/chartex" xmlns:cx1="http://schemas.microsoft.com/office/drawing/2015/9/8/chartex" xmlns:cx2="http://schemas.microsoft.com/office/drawing/2015/10/21/chartex" xmlns:cx3="http://schemas.microsoft.com/office/drawing/2016/5/9/chartex" xmlns:cx4="http://schemas.microsoft.com/office/drawing/2016/5/10/chartex" xmlns:cx5="http://schemas.microsoft.com/office/drawing/2016/5/11/chartex" xmlns:cx6="http://schemas.microsoft.com/office/drawing/2016/5/12/chartex" xmlns:cx7="http://schemas.microsoft.com/office/drawing/2016/5/13/chartex" xmlns:cx8="http://schemas.microsoft.com/office/drawing/2016/5/14/chartex" xmlns:mc="http://schemas.openxmlformats.org/markup-compatibility/2006" xmlns:aink="http://schemas.microsoft.com/office/drawing/2016/ink" xmlns:am3d="http://schemas.microsoft.com/office/drawing/2017/model3d" xmlns:o="urn:schemas-microsoft-com:office:office" xmlns:oel="http://schemas.microsoft.com/office/2019/extlst" xmlns:r="http://schemas.openxmlformats.org/officeDocument/2006/relationships" xmlns:m="http://schemas.openxmlformats.org/officeDocument/2006/math" xmlns:v="urn:schemas-microsoft-com:vml" xmlns:wp14="http://schemas.microsoft.com/office/word/2010/wordprocessingDrawing" xmlns:wp="http://schemas.openxmlformats.org/drawingml/2006/wordprocessingDrawing" xmlns:w10="urn:schemas-microsoft-com:office:word" xmlns:w="http://schemas.openxmlformats.org/wordprocessingml/2006/main" xmlns:w14="http://schemas.microsoft.com/office/word/2010/wordml" xmlns:w15="http://schemas.microsoft.com/office/word/2012/wordml" xmlns:w16cex="http://schemas.microsoft.com/office/word/2018/wordml/cex" xmlns:w16cid="http://schemas.microsoft.com/office/word/2016/wordml/cid" xmlns:w16="http://schemas.microsoft.com/office/word/2018/wordml" xmlns:w16sdtdh="http://schemas.microsoft.com/office/word/2020/wordml/sdtdatahash" xmlns:w16se="http://schemas.microsoft.com/office/word/2015/wordml/symex" xmlns:wpg="http://schemas.microsoft.com/office/word/2010/wordprocessingGroup" xmlns:wpi="http://schemas.microsoft.com/office/word/2010/wordprocessingInk" xmlns:wne="http://schemas.microsoft.com/office/word/2006/wordml" xmlns:wps="http://schemas.microsoft.com/office/word/2010/wordprocessingShape" mc:Ignorable="w14 w15 w16se w16cid w16 w16cex w16sdtdh wp14">
-  <w:p>
-    <w:pPr>
-      <w:pStyle w:val="Fuzeile"/>
-    </w:pPr>
-  </w:p>
-</w:ftr>
-</file>
-
-<file path=word/footer2.xml><?xml version="1.0" encoding="utf-8"?>
-<w:ftr xmlns:wpc="http://schemas.microsoft.com/office/word/2010/wordprocessingCanvas" xmlns:cx="http://schemas.microsoft.com/office/drawing/2014/chartex" xmlns:cx1="http://schemas.microsoft.com/office/drawing/2015/9/8/chartex" xmlns:cx2="http://schemas.microsoft.com/office/drawing/2015/10/21/chartex" xmlns:cx3="http://schemas.microsoft.com/office/drawing/2016/5/9/chartex" xmlns:cx4="http://schemas.microsoft.com/office/drawing/2016/5/10/chartex" xmlns:cx5="http://schemas.microsoft.com/office/drawing/2016/5/11/chartex" xmlns:cx6="http://schemas.microsoft.com/office/drawing/2016/5/12/chartex" xmlns:cx7="http://schemas.microsoft.com/office/drawing/2016/5/13/chartex" xmlns:cx8="http://schemas.microsoft.com/office/drawing/2016/5/14/chartex" xmlns:mc="http://schemas.openxmlformats.org/markup-compatibility/2006" xmlns:aink="http://schemas.microsoft.com/office/drawing/2016/ink" xmlns:am3d="http://schemas.microsoft.com/office/drawing/2017/model3d" xmlns:o="urn:schemas-microsoft-com:office:office" xmlns:oel="http://schemas.microsoft.com/office/2019/extlst" xmlns:r="http://schemas.openxmlformats.org/officeDocument/2006/relationships" xmlns:m="http://schemas.openxmlformats.org/officeDocument/2006/math" xmlns:v="urn:schemas-microsoft-com:vml" xmlns:wp14="http://schemas.microsoft.com/office/word/2010/wordprocessingDrawing" xmlns:wp="http://schemas.openxmlformats.org/drawingml/2006/wordprocessingDrawing" xmlns:w10="urn:schemas-microsoft-com:office:word" xmlns:w="http://schemas.openxmlformats.org/wordprocessingml/2006/main" xmlns:w14="http://schemas.microsoft.com/office/word/2010/wordml" xmlns:w15="http://schemas.microsoft.com/office/word/2012/wordml" xmlns:w16cex="http://schemas.microsoft.com/office/word/2018/wordml/cex" xmlns:w16cid="http://schemas.microsoft.com/office/word/2016/wordml/cid" xmlns:w16="http://schemas.microsoft.com/office/word/2018/wordml" xmlns:w16sdtdh="http://schemas.microsoft.com/office/word/2020/wordml/sdtdatahash" xmlns:w16se="http://schemas.microsoft.com/office/word/2015/wordml/symex" xmlns:wpg="http://schemas.microsoft.com/office/word/2010/wordprocessingGroup" xmlns:wpi="http://schemas.microsoft.com/office/word/2010/wordprocessingInk" xmlns:wne="http://schemas.microsoft.com/office/word/2006/wordml" xmlns:wps="http://schemas.microsoft.com/office/word/2010/wordprocessingShape" mc:Ignorable="w14 w15 w16se w16cid w16 w16cex w16sdtdh wp14">
+<w:ftr xmlns:wpc="http://schemas.microsoft.com/office/word/2010/wordprocessingCanvas" xmlns:cx="http://schemas.microsoft.com/office/drawing/2014/chartex" xmlns:cx1="http://schemas.microsoft.com/office/drawing/2015/9/8/chartex" xmlns:cx2="http://schemas.microsoft.com/office/drawing/2015/10/21/chartex" xmlns:cx3="http://schemas.microsoft.com/office/drawing/2016/5/9/chartex" xmlns:cx4="http://schemas.microsoft.com/office/drawing/2016/5/10/chartex" xmlns:cx5="http://schemas.microsoft.com/office/drawing/2016/5/11/chartex" xmlns:cx6="http://schemas.microsoft.com/office/drawing/2016/5/12/chartex" xmlns:cx7="http://schemas.microsoft.com/office/drawing/2016/5/13/chartex" xmlns:cx8="http://schemas.microsoft.com/office/drawing/2016/5/14/chartex" xmlns:mc="http://schemas.openxmlformats.org/markup-compatibility/2006" xmlns:aink="http://schemas.microsoft.com/office/drawing/2016/ink" xmlns:am3d="http://schemas.microsoft.com/office/drawing/2017/model3d" xmlns:o="urn:schemas-microsoft-com:office:office" xmlns:oel="http://schemas.microsoft.com/office/2019/extlst" xmlns:r="http://schemas.openxmlformats.org/officeDocument/2006/relationships" xmlns:m="http://schemas.openxmlformats.org/officeDocument/2006/math" xmlns:v="urn:schemas-microsoft-com:vml" xmlns:wp14="http://schemas.microsoft.com/office/word/2010/wordprocessingDrawing" xmlns:wp="http://schemas.openxmlformats.org/drawingml/2006/wordprocessingDrawing" xmlns:w10="urn:schemas-microsoft-com:office:word" xmlns:w="http://schemas.openxmlformats.org/wordprocessingml/2006/main" xmlns:w14="http://schemas.microsoft.com/office/word/2010/wordml" xmlns:w15="http://schemas.microsoft.com/office/word/2012/wordml" xmlns:w16cex="http://schemas.microsoft.com/office/word/2018/wordml/cex" xmlns:w16cid="http://schemas.microsoft.com/office/word/2016/wordml/cid" xmlns:w16="http://schemas.microsoft.com/office/word/2018/wordml" xmlns:w16du="http://schemas.microsoft.com/office/word/2023/wordml/word16du" xmlns:w16sdtdh="http://schemas.microsoft.com/office/word/2020/wordml/sdtdatahash" xmlns:w16sdtfl="http://schemas.microsoft.com/office/word/2024/wordml/sdtformatlock" xmlns:w16se="http://schemas.microsoft.com/office/word/2015/wordml/symex" xmlns:wpg="http://schemas.microsoft.com/office/word/2010/wordprocessingGroup" xmlns:wpi="http://schemas.microsoft.com/office/word/2010/wordprocessingInk" xmlns:wne="http://schemas.microsoft.com/office/word/2006/wordml" xmlns:wps="http://schemas.microsoft.com/office/word/2010/wordprocessingShape" mc:Ignorable="w14 w15 w16se w16cid w16 w16cex w16sdtdh w16sdtfl w16du wp14">
   <w:p>
     <w:pPr>
       <w:pBdr>
@@ -4365,18 +5405,8 @@
 </w:ftr>
 </file>
 
-<file path=word/footer3.xml><?xml version="1.0" encoding="utf-8"?>
-<w:ftr xmlns:wpc="http://schemas.microsoft.com/office/word/2010/wordprocessingCanvas" xmlns:cx="http://schemas.microsoft.com/office/drawing/2014/chartex" xmlns:cx1="http://schemas.microsoft.com/office/drawing/2015/9/8/chartex" xmlns:cx2="http://schemas.microsoft.com/office/drawing/2015/10/21/chartex" xmlns:cx3="http://schemas.microsoft.com/office/drawing/2016/5/9/chartex" xmlns:cx4="http://schemas.microsoft.com/office/drawing/2016/5/10/chartex" xmlns:cx5="http://schemas.microsoft.com/office/drawing/2016/5/11/chartex" xmlns:cx6="http://schemas.microsoft.com/office/drawing/2016/5/12/chartex" xmlns:cx7="http://schemas.microsoft.com/office/drawing/2016/5/13/chartex" xmlns:cx8="http://schemas.microsoft.com/office/drawing/2016/5/14/chartex" xmlns:mc="http://schemas.openxmlformats.org/markup-compatibility/2006" xmlns:aink="http://schemas.microsoft.com/office/drawing/2016/ink" xmlns:am3d="http://schemas.microsoft.com/office/drawing/2017/model3d" xmlns:o="urn:schemas-microsoft-com:office:office" xmlns:oel="http://schemas.microsoft.com/office/2019/extlst" xmlns:r="http://schemas.openxmlformats.org/officeDocument/2006/relationships" xmlns:m="http://schemas.openxmlformats.org/officeDocument/2006/math" xmlns:v="urn:schemas-microsoft-com:vml" xmlns:wp14="http://schemas.microsoft.com/office/word/2010/wordprocessingDrawing" xmlns:wp="http://schemas.openxmlformats.org/drawingml/2006/wordprocessingDrawing" xmlns:w10="urn:schemas-microsoft-com:office:word" xmlns:w="http://schemas.openxmlformats.org/wordprocessingml/2006/main" xmlns:w14="http://schemas.microsoft.com/office/word/2010/wordml" xmlns:w15="http://schemas.microsoft.com/office/word/2012/wordml" xmlns:w16cex="http://schemas.microsoft.com/office/word/2018/wordml/cex" xmlns:w16cid="http://schemas.microsoft.com/office/word/2016/wordml/cid" xmlns:w16="http://schemas.microsoft.com/office/word/2018/wordml" xmlns:w16sdtdh="http://schemas.microsoft.com/office/word/2020/wordml/sdtdatahash" xmlns:w16se="http://schemas.microsoft.com/office/word/2015/wordml/symex" xmlns:wpg="http://schemas.microsoft.com/office/word/2010/wordprocessingGroup" xmlns:wpi="http://schemas.microsoft.com/office/word/2010/wordprocessingInk" xmlns:wne="http://schemas.microsoft.com/office/word/2006/wordml" xmlns:wps="http://schemas.microsoft.com/office/word/2010/wordprocessingShape" mc:Ignorable="w14 w15 w16se w16cid w16 w16cex w16sdtdh wp14">
-  <w:p>
-    <w:pPr>
-      <w:pStyle w:val="Fuzeile"/>
-    </w:pPr>
-  </w:p>
-</w:ftr>
-</file>
-
 <file path=word/footnotes.xml><?xml version="1.0" encoding="utf-8"?>
-<w:footnotes xmlns:wpc="http://schemas.microsoft.com/office/word/2010/wordprocessingCanvas" xmlns:cx="http://schemas.microsoft.com/office/drawing/2014/chartex" xmlns:cx1="http://schemas.microsoft.com/office/drawing/2015/9/8/chartex" xmlns:cx2="http://schemas.microsoft.com/office/drawing/2015/10/21/chartex" xmlns:cx3="http://schemas.microsoft.com/office/drawing/2016/5/9/chartex" xmlns:cx4="http://schemas.microsoft.com/office/drawing/2016/5/10/chartex" xmlns:cx5="http://schemas.microsoft.com/office/drawing/2016/5/11/chartex" xmlns:cx6="http://schemas.microsoft.com/office/drawing/2016/5/12/chartex" xmlns:cx7="http://schemas.microsoft.com/office/drawing/2016/5/13/chartex" xmlns:cx8="http://schemas.microsoft.com/office/drawing/2016/5/14/chartex" xmlns:mc="http://schemas.openxmlformats.org/markup-compatibility/2006" xmlns:aink="http://schemas.microsoft.com/office/drawing/2016/ink" xmlns:am3d="http://schemas.microsoft.com/office/drawing/2017/model3d" xmlns:o="urn:schemas-microsoft-com:office:office" xmlns:oel="http://schemas.microsoft.com/office/2019/extlst" xmlns:r="http://schemas.openxmlformats.org/officeDocument/2006/relationships" xmlns:m="http://schemas.openxmlformats.org/officeDocument/2006/math" xmlns:v="urn:schemas-microsoft-com:vml" xmlns:wp14="http://schemas.microsoft.com/office/word/2010/wordprocessingDrawing" xmlns:wp="http://schemas.openxmlformats.org/drawingml/2006/wordprocessingDrawing" xmlns:w10="urn:schemas-microsoft-com:office:word" xmlns:w="http://schemas.openxmlformats.org/wordprocessingml/2006/main" xmlns:w14="http://schemas.microsoft.com/office/word/2010/wordml" xmlns:w15="http://schemas.microsoft.com/office/word/2012/wordml" xmlns:w16cex="http://schemas.microsoft.com/office/word/2018/wordml/cex" xmlns:w16cid="http://schemas.microsoft.com/office/word/2016/wordml/cid" xmlns:w16="http://schemas.microsoft.com/office/word/2018/wordml" xmlns:w16sdtdh="http://schemas.microsoft.com/office/word/2020/wordml/sdtdatahash" xmlns:w16se="http://schemas.microsoft.com/office/word/2015/wordml/symex" xmlns:wpg="http://schemas.microsoft.com/office/word/2010/wordprocessingGroup" xmlns:wpi="http://schemas.microsoft.com/office/word/2010/wordprocessingInk" xmlns:wne="http://schemas.microsoft.com/office/word/2006/wordml" xmlns:wps="http://schemas.microsoft.com/office/word/2010/wordprocessingShape" mc:Ignorable="w14 w15 w16se w16cid w16 w16cex w16sdtdh wp14">
+<w:footnotes xmlns:wpc="http://schemas.microsoft.com/office/word/2010/wordprocessingCanvas" xmlns:cx="http://schemas.microsoft.com/office/drawing/2014/chartex" xmlns:cx1="http://schemas.microsoft.com/office/drawing/2015/9/8/chartex" xmlns:cx2="http://schemas.microsoft.com/office/drawing/2015/10/21/chartex" xmlns:cx3="http://schemas.microsoft.com/office/drawing/2016/5/9/chartex" xmlns:cx4="http://schemas.microsoft.com/office/drawing/2016/5/10/chartex" xmlns:cx5="http://schemas.microsoft.com/office/drawing/2016/5/11/chartex" xmlns:cx6="http://schemas.microsoft.com/office/drawing/2016/5/12/chartex" xmlns:cx7="http://schemas.microsoft.com/office/drawing/2016/5/13/chartex" xmlns:cx8="http://schemas.microsoft.com/office/drawing/2016/5/14/chartex" xmlns:mc="http://schemas.openxmlformats.org/markup-compatibility/2006" xmlns:aink="http://schemas.microsoft.com/office/drawing/2016/ink" xmlns:am3d="http://schemas.microsoft.com/office/drawing/2017/model3d" xmlns:o="urn:schemas-microsoft-com:office:office" xmlns:oel="http://schemas.microsoft.com/office/2019/extlst" xmlns:r="http://schemas.openxmlformats.org/officeDocument/2006/relationships" xmlns:m="http://schemas.openxmlformats.org/officeDocument/2006/math" xmlns:v="urn:schemas-microsoft-com:vml" xmlns:wp14="http://schemas.microsoft.com/office/word/2010/wordprocessingDrawing" xmlns:wp="http://schemas.openxmlformats.org/drawingml/2006/wordprocessingDrawing" xmlns:w10="urn:schemas-microsoft-com:office:word" xmlns:w="http://schemas.openxmlformats.org/wordprocessingml/2006/main" xmlns:w14="http://schemas.microsoft.com/office/word/2010/wordml" xmlns:w15="http://schemas.microsoft.com/office/word/2012/wordml" xmlns:w16cex="http://schemas.microsoft.com/office/word/2018/wordml/cex" xmlns:w16cid="http://schemas.microsoft.com/office/word/2016/wordml/cid" xmlns:w16="http://schemas.microsoft.com/office/word/2018/wordml" xmlns:w16du="http://schemas.microsoft.com/office/word/2023/wordml/word16du" xmlns:w16sdtdh="http://schemas.microsoft.com/office/word/2020/wordml/sdtdatahash" xmlns:w16sdtfl="http://schemas.microsoft.com/office/word/2024/wordml/sdtformatlock" xmlns:w16se="http://schemas.microsoft.com/office/word/2015/wordml/symex" xmlns:wpg="http://schemas.microsoft.com/office/word/2010/wordprocessingGroup" xmlns:wpi="http://schemas.microsoft.com/office/word/2010/wordprocessingInk" xmlns:wne="http://schemas.microsoft.com/office/word/2006/wordml" xmlns:wps="http://schemas.microsoft.com/office/word/2010/wordprocessingShape" mc:Ignorable="w14 w15 w16se w16cid w16 w16cex w16sdtdh w16sdtfl w16du wp14">
   <w:footnote w:type="separator" w:id="-1">
     <w:p>
       <w:r>
@@ -4395,17 +5425,7 @@
 </file>
 
 <file path=word/header1.xml><?xml version="1.0" encoding="utf-8"?>
-<w:hdr xmlns:wpc="http://schemas.microsoft.com/office/word/2010/wordprocessingCanvas" xmlns:cx="http://schemas.microsoft.com/office/drawing/2014/chartex" xmlns:cx1="http://schemas.microsoft.com/office/drawing/2015/9/8/chartex" xmlns:cx2="http://schemas.microsoft.com/office/drawing/2015/10/21/chartex" xmlns:cx3="http://schemas.microsoft.com/office/drawing/2016/5/9/chartex" xmlns:cx4="http://schemas.microsoft.com/office/drawing/2016/5/10/chartex" xmlns:cx5="http://schemas.microsoft.com/office/drawing/2016/5/11/chartex" xmlns:cx6="http://schemas.microsoft.com/office/drawing/2016/5/12/chartex" xmlns:cx7="http://schemas.microsoft.com/office/drawing/2016/5/13/chartex" xmlns:cx8="http://schemas.microsoft.com/office/drawing/2016/5/14/chartex" xmlns:mc="http://schemas.openxmlformats.org/markup-compatibility/2006" xmlns:aink="http://schemas.microsoft.com/office/drawing/2016/ink" xmlns:am3d="http://schemas.microsoft.com/office/drawing/2017/model3d" xmlns:o="urn:schemas-microsoft-com:office:office" xmlns:oel="http://schemas.microsoft.com/office/2019/extlst" xmlns:r="http://schemas.openxmlformats.org/officeDocument/2006/relationships" xmlns:m="http://schemas.openxmlformats.org/officeDocument/2006/math" xmlns:v="urn:schemas-microsoft-com:vml" xmlns:wp14="http://schemas.microsoft.com/office/word/2010/wordprocessingDrawing" xmlns:wp="http://schemas.openxmlformats.org/drawingml/2006/wordprocessingDrawing" xmlns:w10="urn:schemas-microsoft-com:office:word" xmlns:w="http://schemas.openxmlformats.org/wordprocessingml/2006/main" xmlns:w14="http://schemas.microsoft.com/office/word/2010/wordml" xmlns:w15="http://schemas.microsoft.com/office/word/2012/wordml" xmlns:w16cex="http://schemas.microsoft.com/office/word/2018/wordml/cex" xmlns:w16cid="http://schemas.microsoft.com/office/word/2016/wordml/cid" xmlns:w16="http://schemas.microsoft.com/office/word/2018/wordml" xmlns:w16sdtdh="http://schemas.microsoft.com/office/word/2020/wordml/sdtdatahash" xmlns:w16se="http://schemas.microsoft.com/office/word/2015/wordml/symex" xmlns:wpg="http://schemas.microsoft.com/office/word/2010/wordprocessingGroup" xmlns:wpi="http://schemas.microsoft.com/office/word/2010/wordprocessingInk" xmlns:wne="http://schemas.microsoft.com/office/word/2006/wordml" xmlns:wps="http://schemas.microsoft.com/office/word/2010/wordprocessingShape" mc:Ignorable="w14 w15 w16se w16cid w16 w16cex w16sdtdh wp14">
-  <w:p>
-    <w:pPr>
-      <w:pStyle w:val="Kopfzeile"/>
-    </w:pPr>
-  </w:p>
-</w:hdr>
-</file>
-
-<file path=word/header2.xml><?xml version="1.0" encoding="utf-8"?>
-<w:hdr xmlns:wpc="http://schemas.microsoft.com/office/word/2010/wordprocessingCanvas" xmlns:cx="http://schemas.microsoft.com/office/drawing/2014/chartex" xmlns:cx1="http://schemas.microsoft.com/office/drawing/2015/9/8/chartex" xmlns:cx2="http://schemas.microsoft.com/office/drawing/2015/10/21/chartex" xmlns:cx3="http://schemas.microsoft.com/office/drawing/2016/5/9/chartex" xmlns:cx4="http://schemas.microsoft.com/office/drawing/2016/5/10/chartex" xmlns:cx5="http://schemas.microsoft.com/office/drawing/2016/5/11/chartex" xmlns:cx6="http://schemas.microsoft.com/office/drawing/2016/5/12/chartex" xmlns:cx7="http://schemas.microsoft.com/office/drawing/2016/5/13/chartex" xmlns:cx8="http://schemas.microsoft.com/office/drawing/2016/5/14/chartex" xmlns:mc="http://schemas.openxmlformats.org/markup-compatibility/2006" xmlns:aink="http://schemas.microsoft.com/office/drawing/2016/ink" xmlns:am3d="http://schemas.microsoft.com/office/drawing/2017/model3d" xmlns:o="urn:schemas-microsoft-com:office:office" xmlns:oel="http://schemas.microsoft.com/office/2019/extlst" xmlns:r="http://schemas.openxmlformats.org/officeDocument/2006/relationships" xmlns:m="http://schemas.openxmlformats.org/officeDocument/2006/math" xmlns:v="urn:schemas-microsoft-com:vml" xmlns:wp14="http://schemas.microsoft.com/office/word/2010/wordprocessingDrawing" xmlns:wp="http://schemas.openxmlformats.org/drawingml/2006/wordprocessingDrawing" xmlns:w10="urn:schemas-microsoft-com:office:word" xmlns:w="http://schemas.openxmlformats.org/wordprocessingml/2006/main" xmlns:w14="http://schemas.microsoft.com/office/word/2010/wordml" xmlns:w15="http://schemas.microsoft.com/office/word/2012/wordml" xmlns:w16cex="http://schemas.microsoft.com/office/word/2018/wordml/cex" xmlns:w16cid="http://schemas.microsoft.com/office/word/2016/wordml/cid" xmlns:w16="http://schemas.microsoft.com/office/word/2018/wordml" xmlns:w16sdtdh="http://schemas.microsoft.com/office/word/2020/wordml/sdtdatahash" xmlns:w16se="http://schemas.microsoft.com/office/word/2015/wordml/symex" xmlns:wpg="http://schemas.microsoft.com/office/word/2010/wordprocessingGroup" xmlns:wpi="http://schemas.microsoft.com/office/word/2010/wordprocessingInk" xmlns:wne="http://schemas.microsoft.com/office/word/2006/wordml" xmlns:wps="http://schemas.microsoft.com/office/word/2010/wordprocessingShape" mc:Ignorable="w14 w15 w16se w16cid w16 w16cex w16sdtdh wp14">
+<w:hdr xmlns:wpc="http://schemas.microsoft.com/office/word/2010/wordprocessingCanvas" xmlns:cx="http://schemas.microsoft.com/office/drawing/2014/chartex" xmlns:cx1="http://schemas.microsoft.com/office/drawing/2015/9/8/chartex" xmlns:cx2="http://schemas.microsoft.com/office/drawing/2015/10/21/chartex" xmlns:cx3="http://schemas.microsoft.com/office/drawing/2016/5/9/chartex" xmlns:cx4="http://schemas.microsoft.com/office/drawing/2016/5/10/chartex" xmlns:cx5="http://schemas.microsoft.com/office/drawing/2016/5/11/chartex" xmlns:cx6="http://schemas.microsoft.com/office/drawing/2016/5/12/chartex" xmlns:cx7="http://schemas.microsoft.com/office/drawing/2016/5/13/chartex" xmlns:cx8="http://schemas.microsoft.com/office/drawing/2016/5/14/chartex" xmlns:mc="http://schemas.openxmlformats.org/markup-compatibility/2006" xmlns:aink="http://schemas.microsoft.com/office/drawing/2016/ink" xmlns:am3d="http://schemas.microsoft.com/office/drawing/2017/model3d" xmlns:o="urn:schemas-microsoft-com:office:office" xmlns:oel="http://schemas.microsoft.com/office/2019/extlst" xmlns:r="http://schemas.openxmlformats.org/officeDocument/2006/relationships" xmlns:m="http://schemas.openxmlformats.org/officeDocument/2006/math" xmlns:v="urn:schemas-microsoft-com:vml" xmlns:wp14="http://schemas.microsoft.com/office/word/2010/wordprocessingDrawing" xmlns:wp="http://schemas.openxmlformats.org/drawingml/2006/wordprocessingDrawing" xmlns:w10="urn:schemas-microsoft-com:office:word" xmlns:w="http://schemas.openxmlformats.org/wordprocessingml/2006/main" xmlns:w14="http://schemas.microsoft.com/office/word/2010/wordml" xmlns:w15="http://schemas.microsoft.com/office/word/2012/wordml" xmlns:w16cex="http://schemas.microsoft.com/office/word/2018/wordml/cex" xmlns:w16cid="http://schemas.microsoft.com/office/word/2016/wordml/cid" xmlns:w16="http://schemas.microsoft.com/office/word/2018/wordml" xmlns:w16du="http://schemas.microsoft.com/office/word/2023/wordml/word16du" xmlns:w16sdtdh="http://schemas.microsoft.com/office/word/2020/wordml/sdtdatahash" xmlns:w16sdtfl="http://schemas.microsoft.com/office/word/2024/wordml/sdtformatlock" xmlns:w16se="http://schemas.microsoft.com/office/word/2015/wordml/symex" xmlns:wpg="http://schemas.microsoft.com/office/word/2010/wordprocessingGroup" xmlns:wpi="http://schemas.microsoft.com/office/word/2010/wordprocessingInk" xmlns:wne="http://schemas.microsoft.com/office/word/2006/wordml" xmlns:wps="http://schemas.microsoft.com/office/word/2010/wordprocessingShape" mc:Ignorable="w14 w15 w16se w16cid w16 w16cex w16sdtdh w16sdtfl w16du wp14">
   <w:p>
     <w:pPr>
       <w:pStyle w:val="Kopfzeile"/>
@@ -4419,10 +5439,7 @@
       </w:tabs>
     </w:pPr>
     <w:r>
-      <w:t>Equipment</w:t>
-    </w:r>
-    <w:r>
-      <w:t>Augment</w:t>
+      <w:t>EquipmentAugment</w:t>
     </w:r>
     <w:r>
       <w:tab/>
@@ -4434,7 +5451,7 @@
       <w:t>.</w:t>
     </w:r>
     <w:r>
-      <w:t>1</w:t>
+      <w:t>2</w:t>
     </w:r>
     <w:r>
       <w:t>.0</w:t>
@@ -4458,18 +5475,8 @@
 </w:hdr>
 </file>
 
-<file path=word/header3.xml><?xml version="1.0" encoding="utf-8"?>
-<w:hdr xmlns:wpc="http://schemas.microsoft.com/office/word/2010/wordprocessingCanvas" xmlns:cx="http://schemas.microsoft.com/office/drawing/2014/chartex" xmlns:cx1="http://schemas.microsoft.com/office/drawing/2015/9/8/chartex" xmlns:cx2="http://schemas.microsoft.com/office/drawing/2015/10/21/chartex" xmlns:cx3="http://schemas.microsoft.com/office/drawing/2016/5/9/chartex" xmlns:cx4="http://schemas.microsoft.com/office/drawing/2016/5/10/chartex" xmlns:cx5="http://schemas.microsoft.com/office/drawing/2016/5/11/chartex" xmlns:cx6="http://schemas.microsoft.com/office/drawing/2016/5/12/chartex" xmlns:cx7="http://schemas.microsoft.com/office/drawing/2016/5/13/chartex" xmlns:cx8="http://schemas.microsoft.com/office/drawing/2016/5/14/chartex" xmlns:mc="http://schemas.openxmlformats.org/markup-compatibility/2006" xmlns:aink="http://schemas.microsoft.com/office/drawing/2016/ink" xmlns:am3d="http://schemas.microsoft.com/office/drawing/2017/model3d" xmlns:o="urn:schemas-microsoft-com:office:office" xmlns:oel="http://schemas.microsoft.com/office/2019/extlst" xmlns:r="http://schemas.openxmlformats.org/officeDocument/2006/relationships" xmlns:m="http://schemas.openxmlformats.org/officeDocument/2006/math" xmlns:v="urn:schemas-microsoft-com:vml" xmlns:wp14="http://schemas.microsoft.com/office/word/2010/wordprocessingDrawing" xmlns:wp="http://schemas.openxmlformats.org/drawingml/2006/wordprocessingDrawing" xmlns:w10="urn:schemas-microsoft-com:office:word" xmlns:w="http://schemas.openxmlformats.org/wordprocessingml/2006/main" xmlns:w14="http://schemas.microsoft.com/office/word/2010/wordml" xmlns:w15="http://schemas.microsoft.com/office/word/2012/wordml" xmlns:w16cex="http://schemas.microsoft.com/office/word/2018/wordml/cex" xmlns:w16cid="http://schemas.microsoft.com/office/word/2016/wordml/cid" xmlns:w16="http://schemas.microsoft.com/office/word/2018/wordml" xmlns:w16sdtdh="http://schemas.microsoft.com/office/word/2020/wordml/sdtdatahash" xmlns:w16se="http://schemas.microsoft.com/office/word/2015/wordml/symex" xmlns:wpg="http://schemas.microsoft.com/office/word/2010/wordprocessingGroup" xmlns:wpi="http://schemas.microsoft.com/office/word/2010/wordprocessingInk" xmlns:wne="http://schemas.microsoft.com/office/word/2006/wordml" xmlns:wps="http://schemas.microsoft.com/office/word/2010/wordprocessingShape" mc:Ignorable="w14 w15 w16se w16cid w16 w16cex w16sdtdh wp14">
-  <w:p>
-    <w:pPr>
-      <w:pStyle w:val="Kopfzeile"/>
-    </w:pPr>
-  </w:p>
-</w:hdr>
-</file>
-
 <file path=word/numbering.xml><?xml version="1.0" encoding="utf-8"?>
-<w:numbering xmlns:wpc="http://schemas.microsoft.com/office/word/2010/wordprocessingCanvas" xmlns:cx="http://schemas.microsoft.com/office/drawing/2014/chartex" xmlns:cx1="http://schemas.microsoft.com/office/drawing/2015/9/8/chartex" xmlns:cx2="http://schemas.microsoft.com/office/drawing/2015/10/21/chartex" xmlns:cx3="http://schemas.microsoft.com/office/drawing/2016/5/9/chartex" xmlns:cx4="http://schemas.microsoft.com/office/drawing/2016/5/10/chartex" xmlns:cx5="http://schemas.microsoft.com/office/drawing/2016/5/11/chartex" xmlns:cx6="http://schemas.microsoft.com/office/drawing/2016/5/12/chartex" xmlns:cx7="http://schemas.microsoft.com/office/drawing/2016/5/13/chartex" xmlns:cx8="http://schemas.microsoft.com/office/drawing/2016/5/14/chartex" xmlns:mc="http://schemas.openxmlformats.org/markup-compatibility/2006" xmlns:aink="http://schemas.microsoft.com/office/drawing/2016/ink" xmlns:am3d="http://schemas.microsoft.com/office/drawing/2017/model3d" xmlns:o="urn:schemas-microsoft-com:office:office" xmlns:oel="http://schemas.microsoft.com/office/2019/extlst" xmlns:r="http://schemas.openxmlformats.org/officeDocument/2006/relationships" xmlns:m="http://schemas.openxmlformats.org/officeDocument/2006/math" xmlns:v="urn:schemas-microsoft-com:vml" xmlns:wp14="http://schemas.microsoft.com/office/word/2010/wordprocessingDrawing" xmlns:wp="http://schemas.openxmlformats.org/drawingml/2006/wordprocessingDrawing" xmlns:w10="urn:schemas-microsoft-com:office:word" xmlns:w="http://schemas.openxmlformats.org/wordprocessingml/2006/main" xmlns:w14="http://schemas.microsoft.com/office/word/2010/wordml" xmlns:w15="http://schemas.microsoft.com/office/word/2012/wordml" xmlns:w16cex="http://schemas.microsoft.com/office/word/2018/wordml/cex" xmlns:w16cid="http://schemas.microsoft.com/office/word/2016/wordml/cid" xmlns:w16="http://schemas.microsoft.com/office/word/2018/wordml" xmlns:w16sdtdh="http://schemas.microsoft.com/office/word/2020/wordml/sdtdatahash" xmlns:w16se="http://schemas.microsoft.com/office/word/2015/wordml/symex" xmlns:wpg="http://schemas.microsoft.com/office/word/2010/wordprocessingGroup" xmlns:wpi="http://schemas.microsoft.com/office/word/2010/wordprocessingInk" xmlns:wne="http://schemas.microsoft.com/office/word/2006/wordml" xmlns:wps="http://schemas.microsoft.com/office/word/2010/wordprocessingShape" mc:Ignorable="w14 w15 w16se w16cid w16 w16cex w16sdtdh wp14">
+<w:numbering xmlns:wpc="http://schemas.microsoft.com/office/word/2010/wordprocessingCanvas" xmlns:cx="http://schemas.microsoft.com/office/drawing/2014/chartex" xmlns:cx1="http://schemas.microsoft.com/office/drawing/2015/9/8/chartex" xmlns:cx2="http://schemas.microsoft.com/office/drawing/2015/10/21/chartex" xmlns:cx3="http://schemas.microsoft.com/office/drawing/2016/5/9/chartex" xmlns:cx4="http://schemas.microsoft.com/office/drawing/2016/5/10/chartex" xmlns:cx5="http://schemas.microsoft.com/office/drawing/2016/5/11/chartex" xmlns:cx6="http://schemas.microsoft.com/office/drawing/2016/5/12/chartex" xmlns:cx7="http://schemas.microsoft.com/office/drawing/2016/5/13/chartex" xmlns:cx8="http://schemas.microsoft.com/office/drawing/2016/5/14/chartex" xmlns:mc="http://schemas.openxmlformats.org/markup-compatibility/2006" xmlns:aink="http://schemas.microsoft.com/office/drawing/2016/ink" xmlns:am3d="http://schemas.microsoft.com/office/drawing/2017/model3d" xmlns:o="urn:schemas-microsoft-com:office:office" xmlns:oel="http://schemas.microsoft.com/office/2019/extlst" xmlns:r="http://schemas.openxmlformats.org/officeDocument/2006/relationships" xmlns:m="http://schemas.openxmlformats.org/officeDocument/2006/math" xmlns:v="urn:schemas-microsoft-com:vml" xmlns:wp14="http://schemas.microsoft.com/office/word/2010/wordprocessingDrawing" xmlns:wp="http://schemas.openxmlformats.org/drawingml/2006/wordprocessingDrawing" xmlns:w10="urn:schemas-microsoft-com:office:word" xmlns:w="http://schemas.openxmlformats.org/wordprocessingml/2006/main" xmlns:w14="http://schemas.microsoft.com/office/word/2010/wordml" xmlns:w15="http://schemas.microsoft.com/office/word/2012/wordml" xmlns:w16cex="http://schemas.microsoft.com/office/word/2018/wordml/cex" xmlns:w16cid="http://schemas.microsoft.com/office/word/2016/wordml/cid" xmlns:w16="http://schemas.microsoft.com/office/word/2018/wordml" xmlns:w16du="http://schemas.microsoft.com/office/word/2023/wordml/word16du" xmlns:w16sdtdh="http://schemas.microsoft.com/office/word/2020/wordml/sdtdatahash" xmlns:w16sdtfl="http://schemas.microsoft.com/office/word/2024/wordml/sdtformatlock" xmlns:w16se="http://schemas.microsoft.com/office/word/2015/wordml/symex" xmlns:wpg="http://schemas.microsoft.com/office/word/2010/wordprocessingGroup" xmlns:wpi="http://schemas.microsoft.com/office/word/2010/wordprocessingInk" xmlns:wne="http://schemas.microsoft.com/office/word/2006/wordml" xmlns:wps="http://schemas.microsoft.com/office/word/2010/wordprocessingShape" mc:Ignorable="w14 w15 w16se w16cid w16 w16cex w16sdtdh w16sdtfl w16du wp14">
   <w:abstractNum w:abstractNumId="0" w15:restartNumberingAfterBreak="0">
     <w:nsid w:val="FFFFFF7D"/>
     <w:multiLevelType w:val="singleLevel"/>
@@ -6475,86 +7482,86 @@
       </w:pPr>
     </w:lvl>
   </w:abstractNum>
-  <w:num w:numId="1" w16cid:durableId="411270358">
+  <w:num w:numId="1" w16cid:durableId="1633290767">
     <w:abstractNumId w:val="5"/>
   </w:num>
-  <w:num w:numId="2" w16cid:durableId="1456026074">
+  <w:num w:numId="2" w16cid:durableId="593517507">
     <w:abstractNumId w:val="6"/>
   </w:num>
-  <w:num w:numId="3" w16cid:durableId="912743633">
+  <w:num w:numId="3" w16cid:durableId="463693869">
     <w:abstractNumId w:val="9"/>
   </w:num>
-  <w:num w:numId="4" w16cid:durableId="1953439699">
+  <w:num w:numId="4" w16cid:durableId="187305539">
     <w:abstractNumId w:val="12"/>
   </w:num>
-  <w:num w:numId="5" w16cid:durableId="1674842868">
+  <w:num w:numId="5" w16cid:durableId="1803648758">
     <w:abstractNumId w:val="19"/>
   </w:num>
-  <w:num w:numId="6" w16cid:durableId="1897231103">
+  <w:num w:numId="6" w16cid:durableId="1540430587">
     <w:abstractNumId w:val="10"/>
   </w:num>
-  <w:num w:numId="7" w16cid:durableId="1513996">
+  <w:num w:numId="7" w16cid:durableId="826361159">
     <w:abstractNumId w:val="11"/>
   </w:num>
-  <w:num w:numId="8" w16cid:durableId="434832661">
+  <w:num w:numId="8" w16cid:durableId="231818368">
     <w:abstractNumId w:val="20"/>
   </w:num>
-  <w:num w:numId="9" w16cid:durableId="131794917">
+  <w:num w:numId="9" w16cid:durableId="2052730034">
     <w:abstractNumId w:val="14"/>
   </w:num>
-  <w:num w:numId="10" w16cid:durableId="990794258">
+  <w:num w:numId="10" w16cid:durableId="1072846335">
     <w:abstractNumId w:val="15"/>
   </w:num>
-  <w:num w:numId="11" w16cid:durableId="1460807725">
+  <w:num w:numId="11" w16cid:durableId="1394040933">
     <w:abstractNumId w:val="7"/>
   </w:num>
-  <w:num w:numId="12" w16cid:durableId="1140465622">
+  <w:num w:numId="12" w16cid:durableId="285477332">
     <w:abstractNumId w:val="2"/>
   </w:num>
-  <w:num w:numId="13" w16cid:durableId="688221433">
+  <w:num w:numId="13" w16cid:durableId="2020890010">
     <w:abstractNumId w:val="18"/>
   </w:num>
-  <w:num w:numId="14" w16cid:durableId="401408993">
+  <w:num w:numId="14" w16cid:durableId="1434279832">
     <w:abstractNumId w:val="17"/>
   </w:num>
-  <w:num w:numId="15" w16cid:durableId="363946705">
+  <w:num w:numId="15" w16cid:durableId="660625176">
     <w:abstractNumId w:val="16"/>
   </w:num>
-  <w:num w:numId="16" w16cid:durableId="507529128">
+  <w:num w:numId="16" w16cid:durableId="1068260502">
     <w:abstractNumId w:val="13"/>
   </w:num>
-  <w:num w:numId="17" w16cid:durableId="1330984633">
+  <w:num w:numId="17" w16cid:durableId="2044942703">
     <w:abstractNumId w:val="0"/>
   </w:num>
-  <w:num w:numId="18" w16cid:durableId="2116249566">
+  <w:num w:numId="18" w16cid:durableId="1177042033">
     <w:abstractNumId w:val="1"/>
   </w:num>
-  <w:num w:numId="19" w16cid:durableId="1208302892">
+  <w:num w:numId="19" w16cid:durableId="1095590561">
     <w:abstractNumId w:val="21"/>
   </w:num>
-  <w:num w:numId="20" w16cid:durableId="1149054787">
+  <w:num w:numId="20" w16cid:durableId="257642507">
     <w:abstractNumId w:val="3"/>
   </w:num>
-  <w:num w:numId="21" w16cid:durableId="718358588">
+  <w:num w:numId="21" w16cid:durableId="962536756">
     <w:abstractNumId w:val="8"/>
   </w:num>
-  <w:num w:numId="22" w16cid:durableId="1812558865">
+  <w:num w:numId="22" w16cid:durableId="1231767916">
     <w:abstractNumId w:val="8"/>
   </w:num>
-  <w:num w:numId="23" w16cid:durableId="1060666922">
+  <w:num w:numId="23" w16cid:durableId="658576928">
     <w:abstractNumId w:val="8"/>
   </w:num>
-  <w:num w:numId="24" w16cid:durableId="460080788">
+  <w:num w:numId="24" w16cid:durableId="1190216809">
     <w:abstractNumId w:val="8"/>
   </w:num>
-  <w:num w:numId="25" w16cid:durableId="2085760630">
+  <w:num w:numId="25" w16cid:durableId="2143383999">
     <w:abstractNumId w:val="4"/>
   </w:num>
 </w:numbering>
 </file>
 
 <file path=word/styles.xml><?xml version="1.0" encoding="utf-8"?>
-<w:styles xmlns:mc="http://schemas.openxmlformats.org/markup-compatibility/2006" xmlns:r="http://schemas.openxmlformats.org/officeDocument/2006/relationships" xmlns:w="http://schemas.openxmlformats.org/wordprocessingml/2006/main" xmlns:w14="http://schemas.microsoft.com/office/word/2010/wordml" xmlns:w15="http://schemas.microsoft.com/office/word/2012/wordml" xmlns:w16cex="http://schemas.microsoft.com/office/word/2018/wordml/cex" xmlns:w16cid="http://schemas.microsoft.com/office/word/2016/wordml/cid" xmlns:w16="http://schemas.microsoft.com/office/word/2018/wordml" xmlns:w16sdtdh="http://schemas.microsoft.com/office/word/2020/wordml/sdtdatahash" xmlns:w16se="http://schemas.microsoft.com/office/word/2015/wordml/symex" mc:Ignorable="w14 w15 w16se w16cid w16 w16cex w16sdtdh">
+<w:styles xmlns:mc="http://schemas.openxmlformats.org/markup-compatibility/2006" xmlns:r="http://schemas.openxmlformats.org/officeDocument/2006/relationships" xmlns:w="http://schemas.openxmlformats.org/wordprocessingml/2006/main" xmlns:w14="http://schemas.microsoft.com/office/word/2010/wordml" xmlns:w15="http://schemas.microsoft.com/office/word/2012/wordml" xmlns:w16cex="http://schemas.microsoft.com/office/word/2018/wordml/cex" xmlns:w16cid="http://schemas.microsoft.com/office/word/2016/wordml/cid" xmlns:w16="http://schemas.microsoft.com/office/word/2018/wordml" xmlns:w16du="http://schemas.microsoft.com/office/word/2023/wordml/word16du" xmlns:w16sdtdh="http://schemas.microsoft.com/office/word/2020/wordml/sdtdatahash" xmlns:w16sdtfl="http://schemas.microsoft.com/office/word/2024/wordml/sdtformatlock" xmlns:w16se="http://schemas.microsoft.com/office/word/2015/wordml/symex" mc:Ignorable="w14 w15 w16se w16cid w16 w16cex w16sdtdh w16sdtfl w16du">
   <w:docDefaults>
     <w:rPrDefault>
       <w:rPr>
@@ -8940,7 +9947,7 @@
 </file>
 
 <file path=customXml/itemProps2.xml><?xml version="1.0" encoding="utf-8"?>
-<ds:datastoreItem xmlns:ds="http://schemas.openxmlformats.org/officeDocument/2006/customXml" ds:itemID="{B80D43D4-D6BE-4766-B858-36ED5477326F}">
+<ds:datastoreItem xmlns:ds="http://schemas.openxmlformats.org/officeDocument/2006/customXml" ds:itemID="{C8611471-B05D-4A2B-B329-AB40AEC00512}">
   <ds:schemaRefs>
     <ds:schemaRef ds:uri="http://schemas.openxmlformats.org/officeDocument/2006/bibliography"/>
   </ds:schemaRefs>

</xml_diff>